<commit_message>
fix: remove pill badge, enable reliable dummy file and audit report PDF downloads, add citation
</commit_message>
<xml_diff>
--- a/BHUMIverse_Project_Proposal.docx
+++ b/BHUMIverse_Project_Proposal.docx
@@ -1,10 +1,10 @@
 
 <file path=word/document.xml><?xml version="1.0" encoding="utf-8"?>
-<w:document xmlns:wpc="http://schemas.microsoft.com/office/word/2010/wordprocessingCanvas" xmlns:mc="http://schemas.openxmlformats.org/markup-compatibility/2006" xmlns:o="urn:schemas-microsoft-com:office:office" xmlns:r="http://schemas.openxmlformats.org/officeDocument/2006/relationships" xmlns:m="http://schemas.openxmlformats.org/officeDocument/2006/math" xmlns:v="urn:schemas-microsoft-com:vml" xmlns:wp14="http://schemas.microsoft.com/office/word/2010/wordprocessingDrawing" xmlns:wp="http://schemas.openxmlformats.org/drawingml/2006/wordprocessingDrawing" xmlns:w10="urn:schemas-microsoft-com:office:word" xmlns:w="http://schemas.openxmlformats.org/wordprocessingml/2006/main" xmlns:w14="http://schemas.microsoft.com/office/word/2010/wordml" xmlns:wpg="http://schemas.microsoft.com/office/word/2010/wordprocessingGroup" xmlns:wpi="http://schemas.microsoft.com/office/word/2010/wordprocessingInk" xmlns:wne="http://schemas.microsoft.com/office/word/2006/wordml" xmlns:wps="http://schemas.microsoft.com/office/word/2010/wordprocessingShape" mc:Ignorable="w14 wp14">
+<w:document xmlns:wpc="http://schemas.microsoft.com/office/word/2010/wordprocessingCanvas" xmlns:mo="http://schemas.microsoft.com/office/mac/office/2008/main" xmlns:mc="http://schemas.openxmlformats.org/markup-compatibility/2006" xmlns:mv="urn:schemas-microsoft-com:mac:vml" xmlns:o="urn:schemas-microsoft-com:office:office" xmlns:r="http://schemas.openxmlformats.org/officeDocument/2006/relationships" xmlns:m="http://schemas.openxmlformats.org/officeDocument/2006/math" xmlns:v="urn:schemas-microsoft-com:vml" xmlns:wp14="http://schemas.microsoft.com/office/word/2010/wordprocessingDrawing" xmlns:wp="http://schemas.openxmlformats.org/drawingml/2006/wordprocessingDrawing" xmlns:w10="urn:schemas-microsoft-com:office:word" xmlns:w="http://schemas.openxmlformats.org/wordprocessingml/2006/main" xmlns:w14="http://schemas.microsoft.com/office/word/2010/wordml" xmlns:wpg="http://schemas.microsoft.com/office/word/2010/wordprocessingGroup" xmlns:wpi="http://schemas.microsoft.com/office/word/2010/wordprocessingInk" xmlns:wne="http://schemas.microsoft.com/office/word/2006/wordml" xmlns:wps="http://schemas.microsoft.com/office/word/2010/wordprocessingShape" mc:Ignorable="w14 wp14">
   <w:body>
     <w:p>
       <w:pPr>
-        <w:spacing w:after="40" w:line="252" w:lineRule="auto"/>
+        <w:spacing w:before="0" w:after="40" w:line="252" w:lineRule="auto"/>
         <w:jc w:val="center"/>
       </w:pPr>
       <w:r>
@@ -19,12 +19,13 @@
     </w:p>
     <w:p>
       <w:pPr>
-        <w:spacing w:after="60" w:line="252" w:lineRule="auto"/>
+        <w:spacing w:before="0" w:after="60" w:line="252" w:lineRule="auto"/>
         <w:jc w:val="center"/>
       </w:pPr>
       <w:r>
         <w:rPr>
           <w:rFonts w:ascii="Times New Roman" w:hAnsi="Times New Roman"/>
+          <w:b w:val="0"/>
           <w:color w:val="000000"/>
           <w:sz w:val="26"/>
         </w:rPr>
@@ -33,28 +34,30 @@
     </w:p>
     <w:p>
       <w:pPr>
-        <w:spacing w:after="40" w:line="252" w:lineRule="auto"/>
+        <w:spacing w:before="0" w:after="40" w:line="252" w:lineRule="auto"/>
         <w:jc w:val="center"/>
       </w:pPr>
       <w:r>
         <w:rPr>
           <w:rFonts w:ascii="Times New Roman" w:hAnsi="Times New Roman"/>
           <w:b/>
+          <w:i w:val="0"/>
           <w:color w:val="000000"/>
           <w:sz w:val="21"/>
         </w:rPr>
-        <w:t xml:space="preserve">LandTech Innovation Hackathon 2026 </w:t>
+        <w:t>LandTech Innovation Hackathon 2026 | Four Page Concept Note</w:t>
       </w:r>
     </w:p>
     <w:p>
       <w:pPr>
-        <w:spacing w:after="40" w:line="252" w:lineRule="auto"/>
+        <w:spacing w:before="0" w:after="40" w:line="252" w:lineRule="auto"/>
         <w:jc w:val="center"/>
       </w:pPr>
       <w:r>
         <w:rPr>
           <w:rFonts w:ascii="Times New Roman" w:hAnsi="Times New Roman"/>
           <w:b/>
+          <w:i w:val="0"/>
           <w:color w:val="000000"/>
           <w:sz w:val="20"/>
         </w:rPr>
@@ -63,30 +66,35 @@
     </w:p>
     <w:p>
       <w:pPr>
-        <w:spacing w:after="40" w:line="252" w:lineRule="auto"/>
+        <w:spacing w:before="0" w:after="40" w:line="252" w:lineRule="auto"/>
         <w:jc w:val="center"/>
       </w:pPr>
       <w:r>
         <w:rPr>
           <w:rFonts w:ascii="Times New Roman" w:hAnsi="Times New Roman"/>
+          <w:b w:val="0"/>
+          <w:i w:val="0"/>
           <w:color w:val="000000"/>
           <w:sz w:val="20"/>
         </w:rPr>
-        <w:t>Track: Digital Land Records,</w:t>
-      </w:r>
-      <w:r>
-        <w:rPr>
-          <w:rFonts w:ascii="Times New Roman" w:hAnsi="Times New Roman"/>
-          <w:color w:val="000000"/>
-          <w:sz w:val="20"/>
-        </w:rPr>
-        <w:t xml:space="preserve"> Verification and Digitization | Date: 18 October 2026</w:t>
+        <w:t>Track: Digital Land Records, Verification and Digitization | Date: 18 October 2026</w:t>
       </w:r>
     </w:p>
     <w:p>
       <w:pPr>
-        <w:spacing w:after="120" w:line="252" w:lineRule="auto"/>
+        <w:spacing w:before="0" w:after="120" w:line="252" w:lineRule="auto"/>
+        <w:jc w:val="center"/>
       </w:pPr>
+      <w:r>
+        <w:rPr>
+          <w:rFonts w:ascii="Times New Roman" w:hAnsi="Times New Roman"/>
+          <w:b w:val="0"/>
+          <w:i/>
+          <w:color w:val="000000"/>
+          <w:sz w:val="19"/>
+        </w:rPr>
+        <w:t>Submitted to: Department of CSE and CSE-TECH, Daffodil International University</w:t>
+      </w:r>
     </w:p>
     <w:p>
       <w:pPr>
@@ -105,7 +113,7 @@
     </w:p>
     <w:p>
       <w:pPr>
-        <w:spacing w:after="60" w:line="254" w:lineRule="auto"/>
+        <w:spacing w:before="0" w:after="60" w:line="254" w:lineRule="auto"/>
       </w:pPr>
       <w:r>
         <w:rPr>
@@ -113,31 +121,7 @@
           <w:color w:val="000000"/>
           <w:sz w:val="24"/>
         </w:rPr>
-        <w:t>BHUMIverse is an intelligent land fraud detection and double-selling prevention platform engineered spe</w:t>
-      </w:r>
-      <w:r>
-        <w:rPr>
-          <w:rFonts w:ascii="Times New Roman" w:hAnsi="Times New Roman"/>
-          <w:color w:val="000000"/>
-          <w:sz w:val="24"/>
-        </w:rPr>
-        <w:t>cifically for Bangladesh. Our platform solves Hackathon category P3 ('Catch Fraud &amp; Double-Selling') by identifying fake and tampered documents, catching cases where the same land is sold to more than one buyer, and revealing dangerous record mismatches be</w:t>
-      </w:r>
-      <w:r>
-        <w:rPr>
-          <w:rFonts w:ascii="Times New Roman" w:hAnsi="Times New Roman"/>
-          <w:color w:val="000000"/>
-          <w:sz w:val="24"/>
-        </w:rPr>
-        <w:t>tween deed registration (Sub-Registry) and mutation (AC Land offices). Citizens and buyers can search by parcel or upload deeds to inspect altered text, verify seller decimal limits, and uncover organized fraud syndicates. The platform delivers an explaina</w:t>
-      </w:r>
-      <w:r>
-        <w:rPr>
-          <w:rFonts w:ascii="Times New Roman" w:hAnsi="Times New Roman"/>
-          <w:color w:val="000000"/>
-          <w:sz w:val="24"/>
-        </w:rPr>
-        <w:t>ble Land Verification Report with an instant Risk Score (Low, Medium, High) and clear next steps in both English and Bengali.</w:t>
+        <w:t>BHUMIverse is an intelligent land fraud detection and double-selling prevention platform engineered specifically for Bangladesh. Our platform solves Hackathon category P3 ('Catch Fraud &amp; Double-Selling') by identifying fake and tampered documents, catching cases where the same land is sold to more than one buyer, and revealing dangerous record mismatches between deed registration (Sub-Registry) and mutation (AC Land offices). Citizens and buyers can search by parcel or upload deeds to inspect altered text, verify seller decimal limits, and uncover organized fraud syndicates. The platform delivers an explainable Land Verification Report with an instant Risk Score (Low, Medium, High) and clear next steps in both English and Bengali.</w:t>
       </w:r>
     </w:p>
     <w:p>
@@ -157,7 +141,7 @@
     </w:p>
     <w:p>
       <w:pPr>
-        <w:spacing w:after="60" w:line="254" w:lineRule="auto"/>
+        <w:spacing w:before="0" w:after="60" w:line="254" w:lineRule="auto"/>
       </w:pPr>
       <w:r>
         <w:rPr>
@@ -165,20 +149,12 @@
           <w:color w:val="000000"/>
           <w:sz w:val="24"/>
         </w:rPr>
-        <w:t>Primary Category: P3 Catch Fraud &amp; Double-Selling (Spot fake documents, double-selling, and regi</w:t>
-      </w:r>
-      <w:r>
-        <w:rPr>
-          <w:rFonts w:ascii="Times New Roman" w:hAnsi="Times New Roman"/>
-          <w:color w:val="000000"/>
-          <w:sz w:val="24"/>
-        </w:rPr>
-        <w:t>stration-mutation mismatches).</w:t>
+        <w:t>Primary Category: P3 Catch Fraud &amp; Double-Selling (Spot fake documents, double-selling, and registration-mutation mismatches).</w:t>
       </w:r>
     </w:p>
     <w:p>
       <w:pPr>
-        <w:spacing w:after="60" w:line="254" w:lineRule="auto"/>
+        <w:spacing w:before="0" w:after="60" w:line="254" w:lineRule="auto"/>
       </w:pPr>
       <w:r>
         <w:rPr>
@@ -186,28 +162,12 @@
           <w:color w:val="000000"/>
           <w:sz w:val="24"/>
         </w:rPr>
-        <w:t>In Bangladesh, over 70% of all civil disputes arise from fraudulent land transactions. Citizens face four severe fraud threats: (1) Fake and tampered deeds where photocopy text, dates, or plot sizes are digitally altered; (2)</w:t>
-      </w:r>
-      <w:r>
-        <w:rPr>
-          <w:rFonts w:ascii="Times New Roman" w:hAnsi="Times New Roman"/>
-          <w:color w:val="000000"/>
-          <w:sz w:val="24"/>
-        </w:rPr>
-        <w:t xml:space="preserve"> Double-selling where dishonest sellers sell the same plot to multiple buyers before any mutation is recorded; (3) Registration-mutation mismatch where registered deeds never get mutated at the AC Land office, leaving the seller's name in official records </w:t>
-      </w:r>
-      <w:r>
-        <w:rPr>
-          <w:rFonts w:ascii="Times New Roman" w:hAnsi="Times New Roman"/>
-          <w:color w:val="000000"/>
-          <w:sz w:val="24"/>
-        </w:rPr>
-        <w:t>to enable second illegal sales; and (4) Fraud syndicates that exploit loopholes across disjointed government offices.</w:t>
+        <w:t>According to empirical studies by the Law Commission of Bangladesh and the World Bank, over 70% of all civil disputes arise from fraudulent land transactions and ownership conflicts [7]. Citizens face four severe fraud threats: (1) Fake and tampered deeds where photocopy text, dates, or plot sizes are digitally altered; (2) Double-selling where dishonest sellers sell the same plot to multiple buyers before any mutation is recorded; (3) Registration-mutation mismatch where registered deeds never get mutated at the AC Land office, leaving the seller's name in official records to enable second illegal sales; and (4) Fraud syndicates that exploit loopholes across disjointed government offices.</w:t>
       </w:r>
     </w:p>
     <w:p>
       <w:pPr>
-        <w:spacing w:after="60" w:line="254" w:lineRule="auto"/>
+        <w:spacing w:before="0" w:after="60" w:line="254" w:lineRule="auto"/>
       </w:pPr>
       <w:r>
         <w:rPr>
@@ -215,15 +175,7 @@
           <w:color w:val="000000"/>
           <w:sz w:val="24"/>
         </w:rPr>
-        <w:t xml:space="preserve">Core Objectives: (a) Spot fake and altered documents using automated Smart Document Diffing; (b) Mathematically detect double-selling and </w:t>
-      </w:r>
-      <w:r>
-        <w:rPr>
-          <w:rFonts w:ascii="Times New Roman" w:hAnsi="Times New Roman"/>
-          <w:color w:val="000000"/>
-          <w:sz w:val="24"/>
-        </w:rPr>
-        <w:t>over-selling by tracking seller remaining decimals; (c) Reconcile deed registration records with mutation khatians to flag broken ownership chains; and (d) Map repeat fraud actors and disputed plots on an interactive fraud network graph.</w:t>
+        <w:t>Core Objectives: (a) Spot fake and altered documents using automated Smart Document Diffing; (b) Mathematically detect double-selling and over-selling by tracking seller remaining decimals; (c) Reconcile deed registration records with mutation khatians to flag broken ownership chains; and (d) Map repeat fraud actors and disputed plots on an interactive fraud network graph.</w:t>
       </w:r>
     </w:p>
     <w:p>
@@ -238,21 +190,12 @@
           <w:color w:val="000000"/>
           <w:sz w:val="24"/>
         </w:rPr>
-        <w:t>3 Existing Service</w:t>
-      </w:r>
-      <w:r>
-        <w:rPr>
-          <w:rFonts w:ascii="Times New Roman" w:hAnsi="Times New Roman"/>
-          <w:b/>
-          <w:color w:val="000000"/>
-          <w:sz w:val="24"/>
-        </w:rPr>
-        <w:t>s and Main Contribution</w:t>
+        <w:t>3 Existing Services and Main Contribution</w:t>
       </w:r>
     </w:p>
     <w:p>
       <w:pPr>
-        <w:spacing w:after="60" w:line="254" w:lineRule="auto"/>
+        <w:spacing w:before="0" w:after="60" w:line="254" w:lineRule="auto"/>
       </w:pPr>
       <w:r>
         <w:rPr>
@@ -260,50 +203,42 @@
           <w:color w:val="000000"/>
           <w:sz w:val="24"/>
         </w:rPr>
-        <w:t>Current government services like e-Porcha, e-Mutation, and online Land Tax operate in silos. Sub-Registry offices record deeds without real-time verification of the seller's live remaining balance at the AC Land office. This gap all</w:t>
-      </w:r>
-      <w:r>
-        <w:rPr>
-          <w:rFonts w:ascii="Times New Roman" w:hAnsi="Times New Roman"/>
-          <w:color w:val="000000"/>
-          <w:sz w:val="24"/>
-        </w:rPr>
-        <w:t>ows dishonest sellers to sell the same plot multiple times. BHUMIverse connects these separated records into an explained fraud-detection matrix.</w:t>
+        <w:t>Current government services like e-Porcha, e-Mutation, and online Land Tax operate in silos. Sub-Registry offices record deeds without real-time verification of the seller's live remaining balance at the AC Land office. This gap allows dishonest sellers to sell the same plot multiple times. BHUMIverse connects these separated records into an explained fraud-detection matrix.</w:t>
       </w:r>
     </w:p>
     <w:tbl>
       <w:tblPr>
-        <w:tblW w:w="0" w:type="auto"/>
+        <w:tblW w:type="auto" w:w="0"/>
         <w:jc w:val="center"/>
+        <w:tblLook w:firstColumn="1" w:firstRow="1" w:lastColumn="0" w:lastRow="0" w:noHBand="0" w:noVBand="1" w:val="04A0"/>
         <w:tblBorders>
           <w:top w:val="single" w:sz="4" w:space="0" w:color="000000"/>
           <w:bottom w:val="single" w:sz="4" w:space="0" w:color="000000"/>
           <w:insideH w:val="single" w:sz="4" w:space="0" w:color="CCCCCC"/>
+          <w:insideV w:val="none"/>
+          <w:left w:val="none"/>
+          <w:right w:val="none"/>
         </w:tblBorders>
-        <w:tblLook w:val="04A0" w:firstRow="1" w:lastRow="0" w:firstColumn="1" w:lastColumn="0" w:noHBand="0" w:noVBand="1"/>
       </w:tblPr>
       <w:tblGrid>
-        <w:gridCol w:w="2592"/>
-        <w:gridCol w:w="3168"/>
-        <w:gridCol w:w="4608"/>
+        <w:gridCol w:w="3456"/>
+        <w:gridCol w:w="3456"/>
+        <w:gridCol w:w="3456"/>
       </w:tblGrid>
       <w:tr>
-        <w:trPr>
-          <w:jc w:val="center"/>
-        </w:trPr>
         <w:tc>
           <w:tcPr>
-            <w:tcW w:w="2592" w:type="dxa"/>
+            <w:tcW w:type="dxa" w:w="2592"/>
             <w:tcMar>
               <w:top w:w="50" w:type="dxa"/>
+              <w:bottom w:w="50" w:type="dxa"/>
               <w:left w:w="70" w:type="dxa"/>
-              <w:bottom w:w="50" w:type="dxa"/>
               <w:right w:w="70" w:type="dxa"/>
             </w:tcMar>
           </w:tcPr>
           <w:p>
             <w:pPr>
-              <w:spacing w:after="0" w:line="252" w:lineRule="auto"/>
+              <w:spacing w:before="0" w:after="0" w:line="252" w:lineRule="auto"/>
             </w:pPr>
             <w:r>
               <w:rPr>
@@ -318,17 +253,17 @@
         </w:tc>
         <w:tc>
           <w:tcPr>
-            <w:tcW w:w="3168" w:type="dxa"/>
+            <w:tcW w:type="dxa" w:w="3168"/>
             <w:tcMar>
               <w:top w:w="50" w:type="dxa"/>
+              <w:bottom w:w="50" w:type="dxa"/>
               <w:left w:w="70" w:type="dxa"/>
-              <w:bottom w:w="50" w:type="dxa"/>
               <w:right w:w="70" w:type="dxa"/>
             </w:tcMar>
           </w:tcPr>
           <w:p>
             <w:pPr>
-              <w:spacing w:after="0" w:line="252" w:lineRule="auto"/>
+              <w:spacing w:before="0" w:after="0" w:line="252" w:lineRule="auto"/>
             </w:pPr>
             <w:r>
               <w:rPr>
@@ -343,17 +278,17 @@
         </w:tc>
         <w:tc>
           <w:tcPr>
-            <w:tcW w:w="4608" w:type="dxa"/>
+            <w:tcW w:type="dxa" w:w="4608"/>
             <w:tcMar>
               <w:top w:w="50" w:type="dxa"/>
+              <w:bottom w:w="50" w:type="dxa"/>
               <w:left w:w="70" w:type="dxa"/>
-              <w:bottom w:w="50" w:type="dxa"/>
               <w:right w:w="70" w:type="dxa"/>
             </w:tcMar>
           </w:tcPr>
           <w:p>
             <w:pPr>
-              <w:spacing w:after="0" w:line="252" w:lineRule="auto"/>
+              <w:spacing w:before="0" w:after="0" w:line="252" w:lineRule="auto"/>
             </w:pPr>
             <w:r>
               <w:rPr>
@@ -368,22 +303,19 @@
         </w:tc>
       </w:tr>
       <w:tr>
-        <w:trPr>
-          <w:jc w:val="center"/>
-        </w:trPr>
         <w:tc>
           <w:tcPr>
-            <w:tcW w:w="2592" w:type="dxa"/>
+            <w:tcW w:type="dxa" w:w="2592"/>
             <w:tcMar>
               <w:top w:w="40" w:type="dxa"/>
+              <w:bottom w:w="40" w:type="dxa"/>
               <w:left w:w="70" w:type="dxa"/>
-              <w:bottom w:w="40" w:type="dxa"/>
               <w:right w:w="70" w:type="dxa"/>
             </w:tcMar>
           </w:tcPr>
           <w:p>
             <w:pPr>
-              <w:spacing w:after="0" w:line="252" w:lineRule="auto"/>
+              <w:spacing w:before="0" w:after="0" w:line="252" w:lineRule="auto"/>
             </w:pPr>
             <w:r>
               <w:rPr>
@@ -391,31 +323,23 @@
                 <w:color w:val="000000"/>
                 <w:sz w:val="20"/>
               </w:rPr>
-              <w:t>e-Porcha &amp; Record</w:t>
-            </w:r>
-            <w:r>
-              <w:rPr>
-                <w:rFonts w:ascii="Times New Roman" w:hAnsi="Times New Roman"/>
-                <w:color w:val="000000"/>
-                <w:sz w:val="20"/>
-              </w:rPr>
-              <w:t xml:space="preserve"> Lookup (land.gov.bd)</w:t>
+              <w:t>e-Porcha &amp; Record Lookup (land.gov.bd)</w:t>
             </w:r>
           </w:p>
         </w:tc>
         <w:tc>
           <w:tcPr>
-            <w:tcW w:w="3168" w:type="dxa"/>
+            <w:tcW w:type="dxa" w:w="3168"/>
             <w:tcMar>
               <w:top w:w="40" w:type="dxa"/>
+              <w:bottom w:w="40" w:type="dxa"/>
               <w:left w:w="70" w:type="dxa"/>
-              <w:bottom w:w="40" w:type="dxa"/>
               <w:right w:w="70" w:type="dxa"/>
             </w:tcMar>
           </w:tcPr>
           <w:p>
             <w:pPr>
-              <w:spacing w:after="0" w:line="252" w:lineRule="auto"/>
+              <w:spacing w:before="0" w:after="0" w:line="252" w:lineRule="auto"/>
             </w:pPr>
             <w:r>
               <w:rPr>
@@ -429,17 +353,17 @@
         </w:tc>
         <w:tc>
           <w:tcPr>
-            <w:tcW w:w="4608" w:type="dxa"/>
+            <w:tcW w:type="dxa" w:w="4608"/>
             <w:tcMar>
               <w:top w:w="40" w:type="dxa"/>
+              <w:bottom w:w="40" w:type="dxa"/>
               <w:left w:w="70" w:type="dxa"/>
-              <w:bottom w:w="40" w:type="dxa"/>
               <w:right w:w="70" w:type="dxa"/>
             </w:tcMar>
           </w:tcPr>
           <w:p>
             <w:pPr>
-              <w:spacing w:after="0" w:line="252" w:lineRule="auto"/>
+              <w:spacing w:before="0" w:after="0" w:line="252" w:lineRule="auto"/>
             </w:pPr>
             <w:r>
               <w:rPr>
@@ -453,22 +377,19 @@
         </w:tc>
       </w:tr>
       <w:tr>
-        <w:trPr>
-          <w:jc w:val="center"/>
-        </w:trPr>
         <w:tc>
           <w:tcPr>
-            <w:tcW w:w="2592" w:type="dxa"/>
+            <w:tcW w:type="dxa" w:w="2592"/>
             <w:tcMar>
               <w:top w:w="40" w:type="dxa"/>
+              <w:bottom w:w="40" w:type="dxa"/>
               <w:left w:w="70" w:type="dxa"/>
-              <w:bottom w:w="40" w:type="dxa"/>
               <w:right w:w="70" w:type="dxa"/>
             </w:tcMar>
           </w:tcPr>
           <w:p>
             <w:pPr>
-              <w:spacing w:after="0" w:line="252" w:lineRule="auto"/>
+              <w:spacing w:before="0" w:after="0" w:line="252" w:lineRule="auto"/>
             </w:pPr>
             <w:r>
               <w:rPr>
@@ -476,31 +397,23 @@
                 <w:color w:val="000000"/>
                 <w:sz w:val="20"/>
               </w:rPr>
-              <w:t>Sub-Regis</w:t>
-            </w:r>
-            <w:r>
-              <w:rPr>
-                <w:rFonts w:ascii="Times New Roman" w:hAnsi="Times New Roman"/>
-                <w:color w:val="000000"/>
-                <w:sz w:val="20"/>
-              </w:rPr>
-              <w:t>try Deed Registration</w:t>
+              <w:t>Sub-Registry Deed Registration</w:t>
             </w:r>
           </w:p>
         </w:tc>
         <w:tc>
           <w:tcPr>
-            <w:tcW w:w="3168" w:type="dxa"/>
+            <w:tcW w:type="dxa" w:w="3168"/>
             <w:tcMar>
               <w:top w:w="40" w:type="dxa"/>
+              <w:bottom w:w="40" w:type="dxa"/>
               <w:left w:w="70" w:type="dxa"/>
-              <w:bottom w:w="40" w:type="dxa"/>
               <w:right w:w="70" w:type="dxa"/>
             </w:tcMar>
           </w:tcPr>
           <w:p>
             <w:pPr>
-              <w:spacing w:after="0" w:line="252" w:lineRule="auto"/>
+              <w:spacing w:before="0" w:after="0" w:line="252" w:lineRule="auto"/>
             </w:pPr>
             <w:r>
               <w:rPr>
@@ -514,17 +427,17 @@
         </w:tc>
         <w:tc>
           <w:tcPr>
-            <w:tcW w:w="4608" w:type="dxa"/>
+            <w:tcW w:type="dxa" w:w="4608"/>
             <w:tcMar>
               <w:top w:w="40" w:type="dxa"/>
+              <w:bottom w:w="40" w:type="dxa"/>
               <w:left w:w="70" w:type="dxa"/>
-              <w:bottom w:w="40" w:type="dxa"/>
               <w:right w:w="70" w:type="dxa"/>
             </w:tcMar>
           </w:tcPr>
           <w:p>
             <w:pPr>
-              <w:spacing w:after="0" w:line="252" w:lineRule="auto"/>
+              <w:spacing w:before="0" w:after="0" w:line="252" w:lineRule="auto"/>
             </w:pPr>
             <w:r>
               <w:rPr>
@@ -532,36 +445,25 @@
                 <w:color w:val="000000"/>
                 <w:sz w:val="20"/>
               </w:rPr>
-              <w:t>Deterministic Rule Engine cross-checks past deeds, catches duplicate sales, and identifies registered deeds lacking mutatio</w:t>
-            </w:r>
-            <w:r>
-              <w:rPr>
-                <w:rFonts w:ascii="Times New Roman" w:hAnsi="Times New Roman"/>
-                <w:color w:val="000000"/>
-                <w:sz w:val="20"/>
-              </w:rPr>
-              <w:t>n.</w:t>
+              <w:t>Deterministic Rule Engine cross-checks past deeds, catches duplicate sales, and identifies registered deeds lacking mutation.</w:t>
             </w:r>
           </w:p>
         </w:tc>
       </w:tr>
       <w:tr>
-        <w:trPr>
-          <w:jc w:val="center"/>
-        </w:trPr>
         <w:tc>
           <w:tcPr>
-            <w:tcW w:w="2592" w:type="dxa"/>
+            <w:tcW w:type="dxa" w:w="2592"/>
             <w:tcMar>
               <w:top w:w="40" w:type="dxa"/>
+              <w:bottom w:w="40" w:type="dxa"/>
               <w:left w:w="70" w:type="dxa"/>
-              <w:bottom w:w="40" w:type="dxa"/>
               <w:right w:w="70" w:type="dxa"/>
             </w:tcMar>
           </w:tcPr>
           <w:p>
             <w:pPr>
-              <w:spacing w:after="0" w:line="252" w:lineRule="auto"/>
+              <w:spacing w:before="0" w:after="0" w:line="252" w:lineRule="auto"/>
             </w:pPr>
             <w:r>
               <w:rPr>
@@ -575,17 +477,17 @@
         </w:tc>
         <w:tc>
           <w:tcPr>
-            <w:tcW w:w="3168" w:type="dxa"/>
+            <w:tcW w:type="dxa" w:w="3168"/>
             <w:tcMar>
               <w:top w:w="40" w:type="dxa"/>
+              <w:bottom w:w="40" w:type="dxa"/>
               <w:left w:w="70" w:type="dxa"/>
-              <w:bottom w:w="40" w:type="dxa"/>
               <w:right w:w="70" w:type="dxa"/>
             </w:tcMar>
           </w:tcPr>
           <w:p>
             <w:pPr>
-              <w:spacing w:after="0" w:line="252" w:lineRule="auto"/>
+              <w:spacing w:before="0" w:after="0" w:line="252" w:lineRule="auto"/>
             </w:pPr>
             <w:r>
               <w:rPr>
@@ -593,32 +495,23 @@
                 <w:color w:val="000000"/>
                 <w:sz w:val="20"/>
               </w:rPr>
-              <w:t xml:space="preserve">Officers and buyers have no automated tool to detect altered </w:t>
-            </w:r>
-            <w:r>
-              <w:rPr>
-                <w:rFonts w:ascii="Times New Roman" w:hAnsi="Times New Roman"/>
-                <w:color w:val="000000"/>
-                <w:sz w:val="20"/>
-              </w:rPr>
-              <w:lastRenderedPageBreak/>
-              <w:t>numbers, dates, or names on photocopy deeds.</w:t>
+              <w:t>Officers and buyers have no automated tool to detect altered numbers, dates, or names on photocopy deeds.</w:t>
             </w:r>
           </w:p>
         </w:tc>
         <w:tc>
           <w:tcPr>
-            <w:tcW w:w="4608" w:type="dxa"/>
+            <w:tcW w:type="dxa" w:w="4608"/>
             <w:tcMar>
               <w:top w:w="40" w:type="dxa"/>
+              <w:bottom w:w="40" w:type="dxa"/>
               <w:left w:w="70" w:type="dxa"/>
-              <w:bottom w:w="40" w:type="dxa"/>
               <w:right w:w="70" w:type="dxa"/>
             </w:tcMar>
           </w:tcPr>
           <w:p>
             <w:pPr>
-              <w:spacing w:after="0" w:line="252" w:lineRule="auto"/>
+              <w:spacing w:before="0" w:after="0" w:line="252" w:lineRule="auto"/>
             </w:pPr>
             <w:r>
               <w:rPr>
@@ -626,46 +519,25 @@
                 <w:color w:val="000000"/>
                 <w:sz w:val="20"/>
               </w:rPr>
-              <w:lastRenderedPageBreak/>
-              <w:t xml:space="preserve">Smart Document Diff tool provides side-by-side visual and OCR comparison to highlight tampered text and </w:t>
-            </w:r>
-            <w:r>
-              <w:rPr>
-                <w:rFonts w:ascii="Times New Roman" w:hAnsi="Times New Roman"/>
-                <w:color w:val="000000"/>
-                <w:sz w:val="20"/>
-              </w:rPr>
-              <w:lastRenderedPageBreak/>
-              <w:t>numbers in</w:t>
-            </w:r>
-            <w:r>
-              <w:rPr>
-                <w:rFonts w:ascii="Times New Roman" w:hAnsi="Times New Roman"/>
-                <w:color w:val="000000"/>
-                <w:sz w:val="20"/>
-              </w:rPr>
-              <w:t xml:space="preserve"> red.</w:t>
+              <w:t>Smart Document Diff tool provides side-by-side visual and OCR comparison to highlight tampered text and numbers in red.</w:t>
             </w:r>
           </w:p>
         </w:tc>
       </w:tr>
       <w:tr>
-        <w:trPr>
-          <w:jc w:val="center"/>
-        </w:trPr>
         <w:tc>
           <w:tcPr>
-            <w:tcW w:w="2592" w:type="dxa"/>
+            <w:tcW w:type="dxa" w:w="2592"/>
             <w:tcMar>
               <w:top w:w="40" w:type="dxa"/>
+              <w:bottom w:w="40" w:type="dxa"/>
               <w:left w:w="70" w:type="dxa"/>
-              <w:bottom w:w="40" w:type="dxa"/>
               <w:right w:w="70" w:type="dxa"/>
             </w:tcMar>
           </w:tcPr>
           <w:p>
             <w:pPr>
-              <w:spacing w:after="0" w:line="252" w:lineRule="auto"/>
+              <w:spacing w:before="0" w:after="0" w:line="252" w:lineRule="auto"/>
             </w:pPr>
             <w:r>
               <w:rPr>
@@ -673,24 +545,23 @@
                 <w:color w:val="000000"/>
                 <w:sz w:val="20"/>
               </w:rPr>
-              <w:lastRenderedPageBreak/>
               <w:t>Fraud Syndicate Monitoring</w:t>
             </w:r>
           </w:p>
         </w:tc>
         <w:tc>
           <w:tcPr>
-            <w:tcW w:w="3168" w:type="dxa"/>
+            <w:tcW w:type="dxa" w:w="3168"/>
             <w:tcMar>
               <w:top w:w="40" w:type="dxa"/>
+              <w:bottom w:w="40" w:type="dxa"/>
               <w:left w:w="70" w:type="dxa"/>
-              <w:bottom w:w="40" w:type="dxa"/>
               <w:right w:w="70" w:type="dxa"/>
             </w:tcMar>
           </w:tcPr>
           <w:p>
             <w:pPr>
-              <w:spacing w:after="0" w:line="252" w:lineRule="auto"/>
+              <w:spacing w:before="0" w:after="0" w:line="252" w:lineRule="auto"/>
             </w:pPr>
             <w:r>
               <w:rPr>
@@ -704,17 +575,17 @@
         </w:tc>
         <w:tc>
           <w:tcPr>
-            <w:tcW w:w="4608" w:type="dxa"/>
+            <w:tcW w:type="dxa" w:w="4608"/>
             <w:tcMar>
               <w:top w:w="40" w:type="dxa"/>
+              <w:bottom w:w="40" w:type="dxa"/>
               <w:left w:w="70" w:type="dxa"/>
-              <w:bottom w:w="40" w:type="dxa"/>
               <w:right w:w="70" w:type="dxa"/>
             </w:tcMar>
           </w:tcPr>
           <w:p>
             <w:pPr>
-              <w:spacing w:after="0" w:line="252" w:lineRule="auto"/>
+              <w:spacing w:before="0" w:after="0" w:line="252" w:lineRule="auto"/>
             </w:pPr>
             <w:r>
               <w:rPr>
@@ -745,7 +616,7 @@
     </w:p>
     <w:p>
       <w:pPr>
-        <w:spacing w:after="60" w:line="254" w:lineRule="auto"/>
+        <w:spacing w:before="0" w:after="60" w:line="254" w:lineRule="auto"/>
       </w:pPr>
       <w:r>
         <w:rPr>
@@ -759,7 +630,7 @@
     <w:p>
       <w:pPr>
         <w:pStyle w:val="ListBullet"/>
-        <w:spacing w:after="40" w:line="252" w:lineRule="auto"/>
+        <w:spacing w:before="0" w:after="40" w:line="252" w:lineRule="auto"/>
       </w:pPr>
       <w:r>
         <w:rPr>
@@ -782,7 +653,7 @@
     <w:p>
       <w:pPr>
         <w:pStyle w:val="ListBullet"/>
-        <w:spacing w:after="40" w:line="252" w:lineRule="auto"/>
+        <w:spacing w:before="0" w:after="40" w:line="252" w:lineRule="auto"/>
       </w:pPr>
       <w:r>
         <w:rPr>
@@ -799,21 +670,13 @@
           <w:color w:val="000000"/>
           <w:sz w:val="24"/>
         </w:rPr>
-        <w:t>User enters Di</w:t>
-      </w:r>
-      <w:r>
-        <w:rPr>
-          <w:rFonts w:ascii="Times New Roman" w:hAnsi="Times New Roman"/>
-          <w:color w:val="000000"/>
-          <w:sz w:val="24"/>
-        </w:rPr>
-        <w:t>strict, Upazila, Mouza, JL Number, Dag, and Khatian number to retrieve historical records.</w:t>
+        <w:t>User enters District, Upazila, Mouza, JL Number, Dag, and Khatian number to retrieve historical records.</w:t>
       </w:r>
     </w:p>
     <w:p>
       <w:pPr>
         <w:pStyle w:val="ListBullet"/>
-        <w:spacing w:after="40" w:line="252" w:lineRule="auto"/>
+        <w:spacing w:before="0" w:after="40" w:line="252" w:lineRule="auto"/>
       </w:pPr>
       <w:r>
         <w:rPr>
@@ -830,21 +693,13 @@
           <w:color w:val="000000"/>
           <w:sz w:val="24"/>
         </w:rPr>
-        <w:t>User uploads scanned deeds or porchas. The system generates a cryptographic SHA-256 fingerprint to immediately flag duplicate file submissi</w:t>
-      </w:r>
-      <w:r>
-        <w:rPr>
-          <w:rFonts w:ascii="Times New Roman" w:hAnsi="Times New Roman"/>
-          <w:color w:val="000000"/>
-          <w:sz w:val="24"/>
-        </w:rPr>
-        <w:t>ons.</w:t>
+        <w:t>User uploads scanned deeds or porchas. The system generates a cryptographic SHA-256 fingerprint to immediately flag duplicate file submissions.</w:t>
       </w:r>
     </w:p>
     <w:p>
       <w:pPr>
         <w:pStyle w:val="ListBullet"/>
-        <w:spacing w:after="40" w:line="252" w:lineRule="auto"/>
+        <w:spacing w:before="0" w:after="40" w:line="252" w:lineRule="auto"/>
       </w:pPr>
       <w:r>
         <w:rPr>
@@ -867,7 +722,7 @@
     <w:p>
       <w:pPr>
         <w:pStyle w:val="ListBullet"/>
-        <w:spacing w:after="40" w:line="252" w:lineRule="auto"/>
+        <w:spacing w:before="0" w:after="40" w:line="252" w:lineRule="auto"/>
       </w:pPr>
       <w:r>
         <w:rPr>
@@ -884,21 +739,13 @@
           <w:color w:val="000000"/>
           <w:sz w:val="24"/>
         </w:rPr>
-        <w:t>Res</w:t>
-      </w:r>
-      <w:r>
-        <w:rPr>
-          <w:rFonts w:ascii="Times New Roman" w:hAnsi="Times New Roman"/>
-          <w:color w:val="000000"/>
-          <w:sz w:val="24"/>
-        </w:rPr>
-        <w:t>ults are displayed on an Explainable Radar Chart (covering Authenticity, Continuity, Custody, Encumbrance, and Consistency) and an interactive Fraud Network Graph.</w:t>
+        <w:t>Results are displayed on an Explainable Radar Chart (covering Authenticity, Continuity, Custody, Encumbrance, and Consistency) and an interactive Fraud Network Graph.</w:t>
       </w:r>
     </w:p>
     <w:p>
       <w:pPr>
         <w:pStyle w:val="ListBullet"/>
-        <w:spacing w:after="40" w:line="252" w:lineRule="auto"/>
+        <w:spacing w:before="0" w:after="40" w:line="252" w:lineRule="auto"/>
       </w:pPr>
       <w:r>
         <w:rPr>
@@ -915,21 +762,13 @@
           <w:color w:val="000000"/>
           <w:sz w:val="24"/>
         </w:rPr>
-        <w:t xml:space="preserve">Platform generates a comprehensive Land Verification Report </w:t>
-      </w:r>
-      <w:r>
-        <w:rPr>
-          <w:rFonts w:ascii="Times New Roman" w:hAnsi="Times New Roman"/>
-          <w:color w:val="000000"/>
-          <w:sz w:val="24"/>
-        </w:rPr>
-        <w:t>with an overall Risk Score (Low, Medium, High), audit verification hash, and downloadable PDF report.</w:t>
+        <w:t>Platform generates a comprehensive Land Verification Report with an overall Risk Score (Low, Medium, High), audit verification hash, and downloadable PDF report.</w:t>
       </w:r>
     </w:p>
     <w:p>
       <w:pPr>
         <w:pStyle w:val="ListBullet"/>
-        <w:spacing w:after="40" w:line="252" w:lineRule="auto"/>
+        <w:spacing w:before="0" w:after="40" w:line="252" w:lineRule="auto"/>
       </w:pPr>
       <w:r>
         <w:rPr>
@@ -951,7 +790,7 @@
     </w:p>
     <w:p>
       <w:pPr>
-        <w:spacing w:after="60" w:line="254" w:lineRule="auto"/>
+        <w:spacing w:before="0" w:after="60" w:line="254" w:lineRule="auto"/>
       </w:pPr>
       <w:r>
         <w:rPr>
@@ -968,23 +807,7 @@
           <w:color w:val="000000"/>
           <w:sz w:val="24"/>
         </w:rPr>
-        <w:t>A seller owns 10 decimal in Savar Mouza (Dag 10482). In 2021, the seller sold 6 decimal to Buyer A via Deed No. 4821. Buyer A delayed filing for mutation. In 2023, the seller produces an old khatian copy showing 10 decima</w:t>
-      </w:r>
-      <w:r>
-        <w:rPr>
-          <w:rFonts w:ascii="Times New Roman" w:hAnsi="Times New Roman"/>
-          <w:color w:val="000000"/>
-          <w:sz w:val="24"/>
-        </w:rPr>
-        <w:t>l and attempts to sell 8 decimal to Buyer B. The BHUMIverse rule engine analyzes past deed transfers and discovers that only 4 decimal remain. When 8 decimal is entered, the system triggers a Critical Double-Selling Alert (6 + 8 = 14 &gt; 10 decimal), stoppin</w:t>
-      </w:r>
-      <w:r>
-        <w:rPr>
-          <w:rFonts w:ascii="Times New Roman" w:hAnsi="Times New Roman"/>
-          <w:color w:val="000000"/>
-          <w:sz w:val="24"/>
-        </w:rPr>
-        <w:t>g the fraudulent sale immediately.</w:t>
+        <w:t>A seller owns 10 decimal in Savar Mouza (Dag 10482). In 2021, the seller sold 6 decimal to Buyer A via Deed No. 4821. Buyer A delayed filing for mutation. In 2023, the seller produces an old khatian copy showing 10 decimal and attempts to sell 8 decimal to Buyer B. The BHUMIverse rule engine analyzes past deed transfers and discovers that only 4 decimal remain. When 8 decimal is entered, the system triggers a Critical Double-Selling Alert (6 + 8 = 14 &gt; 10 decimal), stopping the fraudulent sale immediately.</w:t>
       </w:r>
     </w:p>
     <w:p>
@@ -1004,7 +827,7 @@
     </w:p>
     <w:p>
       <w:pPr>
-        <w:spacing w:after="60" w:line="254" w:lineRule="auto"/>
+        <w:spacing w:before="0" w:after="60" w:line="254" w:lineRule="auto"/>
       </w:pPr>
       <w:r>
         <w:rPr>
@@ -1018,7 +841,7 @@
     <w:p>
       <w:pPr>
         <w:pStyle w:val="ListBullet"/>
-        <w:spacing w:after="40" w:line="252" w:lineRule="auto"/>
+        <w:spacing w:before="0" w:after="40" w:line="252" w:lineRule="auto"/>
       </w:pPr>
       <w:r>
         <w:rPr>
@@ -1035,21 +858,13 @@
           <w:color w:val="000000"/>
           <w:sz w:val="24"/>
         </w:rPr>
-        <w:t>Next.js 16 (App Router), React 19, TypeScript, and Tailwind CSS. Features Vis-network</w:t>
-      </w:r>
-      <w:r>
-        <w:rPr>
-          <w:rFonts w:ascii="Times New Roman" w:hAnsi="Times New Roman"/>
-          <w:color w:val="000000"/>
-          <w:sz w:val="24"/>
-        </w:rPr>
-        <w:t xml:space="preserve"> for interactive fraud syndicate graphs, Chart.js/SVG for explainable radar charts, and full dual-language support (English and Bengali).</w:t>
+        <w:t>Next.js 16 (App Router), React 19, TypeScript, and Tailwind CSS. Features Vis-network for interactive fraud syndicate graphs, Chart.js/SVG for explainable radar charts, and full dual-language support (English and Bengali).</w:t>
       </w:r>
     </w:p>
     <w:p>
       <w:pPr>
         <w:pStyle w:val="ListBullet"/>
-        <w:spacing w:after="40" w:line="252" w:lineRule="auto"/>
+        <w:spacing w:before="0" w:after="40" w:line="252" w:lineRule="auto"/>
       </w:pPr>
       <w:r>
         <w:rPr>
@@ -1066,21 +881,13 @@
           <w:color w:val="000000"/>
           <w:sz w:val="24"/>
         </w:rPr>
-        <w:t xml:space="preserve">FastAPI (Python 3.11) with Pydantic v2 schemas. Implements deterministic rule engines, SHA-256 file </w:t>
-      </w:r>
-      <w:r>
-        <w:rPr>
-          <w:rFonts w:ascii="Times New Roman" w:hAnsi="Times New Roman"/>
-          <w:color w:val="000000"/>
-          <w:sz w:val="24"/>
-        </w:rPr>
-        <w:t>fingerprinting, and audit logging services.</w:t>
+        <w:t>FastAPI (Python 3.11) with Pydantic v2 schemas. Implements deterministic rule engines, SHA-256 file fingerprinting, and audit logging services.</w:t>
       </w:r>
     </w:p>
     <w:p>
       <w:pPr>
         <w:pStyle w:val="ListBullet"/>
-        <w:spacing w:after="40" w:line="252" w:lineRule="auto"/>
+        <w:spacing w:before="0" w:after="40" w:line="252" w:lineRule="auto"/>
       </w:pPr>
       <w:r>
         <w:rPr>
@@ -1103,7 +910,7 @@
     <w:p>
       <w:pPr>
         <w:pStyle w:val="ListBullet"/>
-        <w:spacing w:after="40" w:line="252" w:lineRule="auto"/>
+        <w:spacing w:before="0" w:after="40" w:line="252" w:lineRule="auto"/>
       </w:pPr>
       <w:r>
         <w:rPr>
@@ -1120,21 +927,13 @@
           <w:color w:val="000000"/>
           <w:sz w:val="24"/>
         </w:rPr>
-        <w:t xml:space="preserve">Side-by-side visual difference tool </w:t>
-      </w:r>
-      <w:r>
-        <w:rPr>
-          <w:rFonts w:ascii="Times New Roman" w:hAnsi="Times New Roman"/>
-          <w:color w:val="000000"/>
-          <w:sz w:val="24"/>
-        </w:rPr>
-        <w:t>that compares original deed templates against altered uploaded documents to highlight modified text or numbers.</w:t>
+        <w:t>Side-by-side visual difference tool that compares original deed templates against altered uploaded documents to highlight modified text or numbers.</w:t>
       </w:r>
     </w:p>
     <w:p>
       <w:pPr>
         <w:pStyle w:val="ListBullet"/>
-        <w:spacing w:after="40" w:line="252" w:lineRule="auto"/>
+        <w:spacing w:before="0" w:after="40" w:line="252" w:lineRule="auto"/>
       </w:pPr>
       <w:r>
         <w:rPr>
@@ -1171,7 +970,7 @@
     </w:p>
     <w:p>
       <w:pPr>
-        <w:spacing w:after="60" w:line="254" w:lineRule="auto"/>
+        <w:spacing w:before="0" w:after="60" w:line="254" w:lineRule="auto"/>
       </w:pPr>
       <w:r>
         <w:rPr>
@@ -1179,50 +978,42 @@
           <w:color w:val="000000"/>
           <w:sz w:val="24"/>
         </w:rPr>
-        <w:t xml:space="preserve">Status as of 18 </w:t>
-      </w:r>
-      <w:r>
-        <w:rPr>
-          <w:rFonts w:ascii="Times New Roman" w:hAnsi="Times New Roman"/>
-          <w:color w:val="000000"/>
-          <w:sz w:val="24"/>
-        </w:rPr>
-        <w:t>October 2026: The BHUMIverse prototype is fully built, tested, and operational. All core features can be tested live.</w:t>
+        <w:t>Status as of 18 October 2026: The BHUMIverse prototype is fully built, tested, and operational. All core features can be tested live.</w:t>
       </w:r>
     </w:p>
     <w:tbl>
       <w:tblPr>
-        <w:tblW w:w="0" w:type="auto"/>
+        <w:tblW w:type="auto" w:w="0"/>
         <w:jc w:val="center"/>
+        <w:tblLook w:firstColumn="1" w:firstRow="1" w:lastColumn="0" w:lastRow="0" w:noHBand="0" w:noVBand="1" w:val="04A0"/>
         <w:tblBorders>
           <w:top w:val="single" w:sz="4" w:space="0" w:color="000000"/>
           <w:bottom w:val="single" w:sz="4" w:space="0" w:color="000000"/>
           <w:insideH w:val="single" w:sz="4" w:space="0" w:color="CCCCCC"/>
+          <w:insideV w:val="none"/>
+          <w:left w:val="none"/>
+          <w:right w:val="none"/>
         </w:tblBorders>
-        <w:tblLook w:val="04A0" w:firstRow="1" w:lastRow="0" w:firstColumn="1" w:lastColumn="0" w:noHBand="0" w:noVBand="1"/>
       </w:tblPr>
       <w:tblGrid>
-        <w:gridCol w:w="2592"/>
-        <w:gridCol w:w="2592"/>
-        <w:gridCol w:w="5184"/>
+        <w:gridCol w:w="3456"/>
+        <w:gridCol w:w="3456"/>
+        <w:gridCol w:w="3456"/>
       </w:tblGrid>
       <w:tr>
-        <w:trPr>
-          <w:jc w:val="center"/>
-        </w:trPr>
         <w:tc>
           <w:tcPr>
-            <w:tcW w:w="2592" w:type="dxa"/>
+            <w:tcW w:type="dxa" w:w="2592"/>
             <w:tcMar>
               <w:top w:w="50" w:type="dxa"/>
+              <w:bottom w:w="50" w:type="dxa"/>
               <w:left w:w="70" w:type="dxa"/>
-              <w:bottom w:w="50" w:type="dxa"/>
               <w:right w:w="70" w:type="dxa"/>
             </w:tcMar>
           </w:tcPr>
           <w:p>
             <w:pPr>
-              <w:spacing w:after="0" w:line="252" w:lineRule="auto"/>
+              <w:spacing w:before="0" w:after="0" w:line="252" w:lineRule="auto"/>
             </w:pPr>
             <w:r>
               <w:rPr>
@@ -1237,17 +1028,17 @@
         </w:tc>
         <w:tc>
           <w:tcPr>
-            <w:tcW w:w="2592" w:type="dxa"/>
+            <w:tcW w:type="dxa" w:w="2592"/>
             <w:tcMar>
               <w:top w:w="50" w:type="dxa"/>
+              <w:bottom w:w="50" w:type="dxa"/>
               <w:left w:w="70" w:type="dxa"/>
-              <w:bottom w:w="50" w:type="dxa"/>
               <w:right w:w="70" w:type="dxa"/>
             </w:tcMar>
           </w:tcPr>
           <w:p>
             <w:pPr>
-              <w:spacing w:after="0" w:line="252" w:lineRule="auto"/>
+              <w:spacing w:before="0" w:after="0" w:line="252" w:lineRule="auto"/>
             </w:pPr>
             <w:r>
               <w:rPr>
@@ -1262,17 +1053,17 @@
         </w:tc>
         <w:tc>
           <w:tcPr>
-            <w:tcW w:w="5184" w:type="dxa"/>
+            <w:tcW w:type="dxa" w:w="5184"/>
             <w:tcMar>
               <w:top w:w="50" w:type="dxa"/>
+              <w:bottom w:w="50" w:type="dxa"/>
               <w:left w:w="70" w:type="dxa"/>
-              <w:bottom w:w="50" w:type="dxa"/>
               <w:right w:w="70" w:type="dxa"/>
             </w:tcMar>
           </w:tcPr>
           <w:p>
             <w:pPr>
-              <w:spacing w:after="0" w:line="252" w:lineRule="auto"/>
+              <w:spacing w:before="0" w:after="0" w:line="252" w:lineRule="auto"/>
             </w:pPr>
             <w:r>
               <w:rPr>
@@ -1287,22 +1078,19 @@
         </w:tc>
       </w:tr>
       <w:tr>
-        <w:trPr>
-          <w:jc w:val="center"/>
-        </w:trPr>
         <w:tc>
           <w:tcPr>
-            <w:tcW w:w="2592" w:type="dxa"/>
+            <w:tcW w:type="dxa" w:w="2592"/>
             <w:tcMar>
               <w:top w:w="40" w:type="dxa"/>
+              <w:bottom w:w="40" w:type="dxa"/>
               <w:left w:w="70" w:type="dxa"/>
-              <w:bottom w:w="40" w:type="dxa"/>
               <w:right w:w="70" w:type="dxa"/>
             </w:tcMar>
           </w:tcPr>
           <w:p>
             <w:pPr>
-              <w:spacing w:after="0" w:line="252" w:lineRule="auto"/>
+              <w:spacing w:before="0" w:after="0" w:line="252" w:lineRule="auto"/>
             </w:pPr>
             <w:r>
               <w:rPr>
@@ -1310,24 +1098,23 @@
                 <w:color w:val="000000"/>
                 <w:sz w:val="20"/>
               </w:rPr>
-              <w:lastRenderedPageBreak/>
               <w:t>Double-Selling Detection Engine</w:t>
             </w:r>
           </w:p>
         </w:tc>
         <w:tc>
           <w:tcPr>
-            <w:tcW w:w="2592" w:type="dxa"/>
+            <w:tcW w:type="dxa" w:w="2592"/>
             <w:tcMar>
               <w:top w:w="40" w:type="dxa"/>
+              <w:bottom w:w="40" w:type="dxa"/>
               <w:left w:w="70" w:type="dxa"/>
-              <w:bottom w:w="40" w:type="dxa"/>
               <w:right w:w="70" w:type="dxa"/>
             </w:tcMar>
           </w:tcPr>
           <w:p>
             <w:pPr>
-              <w:spacing w:after="0" w:line="252" w:lineRule="auto"/>
+              <w:spacing w:before="0" w:after="0" w:line="252" w:lineRule="auto"/>
             </w:pPr>
             <w:r>
               <w:rPr>
@@ -1341,17 +1128,17 @@
         </w:tc>
         <w:tc>
           <w:tcPr>
-            <w:tcW w:w="5184" w:type="dxa"/>
+            <w:tcW w:type="dxa" w:w="5184"/>
             <w:tcMar>
               <w:top w:w="40" w:type="dxa"/>
+              <w:bottom w:w="40" w:type="dxa"/>
               <w:left w:w="70" w:type="dxa"/>
-              <w:bottom w:w="40" w:type="dxa"/>
               <w:right w:w="70" w:type="dxa"/>
             </w:tcMar>
           </w:tcPr>
           <w:p>
             <w:pPr>
-              <w:spacing w:after="0" w:line="252" w:lineRule="auto"/>
+              <w:spacing w:before="0" w:after="0" w:line="252" w:lineRule="auto"/>
             </w:pPr>
             <w:r>
               <w:rPr>
@@ -1359,36 +1146,25 @@
                 <w:color w:val="000000"/>
                 <w:sz w:val="20"/>
               </w:rPr>
-              <w:t xml:space="preserve">Computes </w:t>
-            </w:r>
-            <w:r>
-              <w:rPr>
-                <w:rFonts w:ascii="Times New Roman" w:hAnsi="Times New Roman"/>
-                <w:color w:val="000000"/>
-                <w:sz w:val="20"/>
-              </w:rPr>
-              <w:t>remaining seller share balance; alerts when proposed sale exceeds owned decimals.</w:t>
+              <w:t>Computes remaining seller share balance; alerts when proposed sale exceeds owned decimals.</w:t>
             </w:r>
           </w:p>
         </w:tc>
       </w:tr>
       <w:tr>
-        <w:trPr>
-          <w:jc w:val="center"/>
-        </w:trPr>
         <w:tc>
           <w:tcPr>
-            <w:tcW w:w="2592" w:type="dxa"/>
+            <w:tcW w:type="dxa" w:w="2592"/>
             <w:tcMar>
               <w:top w:w="40" w:type="dxa"/>
+              <w:bottom w:w="40" w:type="dxa"/>
               <w:left w:w="70" w:type="dxa"/>
-              <w:bottom w:w="40" w:type="dxa"/>
               <w:right w:w="70" w:type="dxa"/>
             </w:tcMar>
           </w:tcPr>
           <w:p>
             <w:pPr>
-              <w:spacing w:after="0" w:line="252" w:lineRule="auto"/>
+              <w:spacing w:before="0" w:after="0" w:line="252" w:lineRule="auto"/>
             </w:pPr>
             <w:r>
               <w:rPr>
@@ -1402,17 +1178,17 @@
         </w:tc>
         <w:tc>
           <w:tcPr>
-            <w:tcW w:w="2592" w:type="dxa"/>
+            <w:tcW w:type="dxa" w:w="2592"/>
             <w:tcMar>
               <w:top w:w="40" w:type="dxa"/>
+              <w:bottom w:w="40" w:type="dxa"/>
               <w:left w:w="70" w:type="dxa"/>
-              <w:bottom w:w="40" w:type="dxa"/>
               <w:right w:w="70" w:type="dxa"/>
             </w:tcMar>
           </w:tcPr>
           <w:p>
             <w:pPr>
-              <w:spacing w:after="0" w:line="252" w:lineRule="auto"/>
+              <w:spacing w:before="0" w:after="0" w:line="252" w:lineRule="auto"/>
             </w:pPr>
             <w:r>
               <w:rPr>
@@ -1426,17 +1202,17 @@
         </w:tc>
         <w:tc>
           <w:tcPr>
-            <w:tcW w:w="5184" w:type="dxa"/>
+            <w:tcW w:type="dxa" w:w="5184"/>
             <w:tcMar>
               <w:top w:w="40" w:type="dxa"/>
+              <w:bottom w:w="40" w:type="dxa"/>
               <w:left w:w="70" w:type="dxa"/>
-              <w:bottom w:w="40" w:type="dxa"/>
               <w:right w:w="70" w:type="dxa"/>
             </w:tcMar>
           </w:tcPr>
           <w:p>
             <w:pPr>
-              <w:spacing w:after="0" w:line="252" w:lineRule="auto"/>
+              <w:spacing w:before="0" w:after="0" w:line="252" w:lineRule="auto"/>
             </w:pPr>
             <w:r>
               <w:rPr>
@@ -1450,22 +1226,19 @@
         </w:tc>
       </w:tr>
       <w:tr>
-        <w:trPr>
-          <w:jc w:val="center"/>
-        </w:trPr>
         <w:tc>
           <w:tcPr>
-            <w:tcW w:w="2592" w:type="dxa"/>
+            <w:tcW w:type="dxa" w:w="2592"/>
             <w:tcMar>
               <w:top w:w="40" w:type="dxa"/>
+              <w:bottom w:w="40" w:type="dxa"/>
               <w:left w:w="70" w:type="dxa"/>
-              <w:bottom w:w="40" w:type="dxa"/>
               <w:right w:w="70" w:type="dxa"/>
             </w:tcMar>
           </w:tcPr>
           <w:p>
             <w:pPr>
-              <w:spacing w:after="0" w:line="252" w:lineRule="auto"/>
+              <w:spacing w:before="0" w:after="0" w:line="252" w:lineRule="auto"/>
             </w:pPr>
             <w:r>
               <w:rPr>
@@ -1479,17 +1252,17 @@
         </w:tc>
         <w:tc>
           <w:tcPr>
-            <w:tcW w:w="2592" w:type="dxa"/>
+            <w:tcW w:type="dxa" w:w="2592"/>
             <w:tcMar>
               <w:top w:w="40" w:type="dxa"/>
+              <w:bottom w:w="40" w:type="dxa"/>
               <w:left w:w="70" w:type="dxa"/>
-              <w:bottom w:w="40" w:type="dxa"/>
               <w:right w:w="70" w:type="dxa"/>
             </w:tcMar>
           </w:tcPr>
           <w:p>
             <w:pPr>
-              <w:spacing w:after="0" w:line="252" w:lineRule="auto"/>
+              <w:spacing w:before="0" w:after="0" w:line="252" w:lineRule="auto"/>
             </w:pPr>
             <w:r>
               <w:rPr>
@@ -1497,31 +1270,23 @@
                 <w:color w:val="000000"/>
                 <w:sz w:val="20"/>
               </w:rPr>
-              <w:t xml:space="preserve">100% </w:t>
-            </w:r>
-            <w:r>
-              <w:rPr>
-                <w:rFonts w:ascii="Times New Roman" w:hAnsi="Times New Roman"/>
-                <w:color w:val="000000"/>
-                <w:sz w:val="20"/>
-              </w:rPr>
-              <w:t>Implemented</w:t>
+              <w:t>100% Implemented</w:t>
             </w:r>
           </w:p>
         </w:tc>
         <w:tc>
           <w:tcPr>
-            <w:tcW w:w="5184" w:type="dxa"/>
+            <w:tcW w:type="dxa" w:w="5184"/>
             <w:tcMar>
               <w:top w:w="40" w:type="dxa"/>
+              <w:bottom w:w="40" w:type="dxa"/>
               <w:left w:w="70" w:type="dxa"/>
-              <w:bottom w:w="40" w:type="dxa"/>
               <w:right w:w="70" w:type="dxa"/>
             </w:tcMar>
           </w:tcPr>
           <w:p>
             <w:pPr>
-              <w:spacing w:after="0" w:line="252" w:lineRule="auto"/>
+              <w:spacing w:before="0" w:after="0" w:line="252" w:lineRule="auto"/>
             </w:pPr>
             <w:r>
               <w:rPr>
@@ -1535,22 +1300,19 @@
         </w:tc>
       </w:tr>
       <w:tr>
-        <w:trPr>
-          <w:jc w:val="center"/>
-        </w:trPr>
         <w:tc>
           <w:tcPr>
-            <w:tcW w:w="2592" w:type="dxa"/>
+            <w:tcW w:type="dxa" w:w="2592"/>
             <w:tcMar>
               <w:top w:w="40" w:type="dxa"/>
+              <w:bottom w:w="40" w:type="dxa"/>
               <w:left w:w="70" w:type="dxa"/>
-              <w:bottom w:w="40" w:type="dxa"/>
               <w:right w:w="70" w:type="dxa"/>
             </w:tcMar>
           </w:tcPr>
           <w:p>
             <w:pPr>
-              <w:spacing w:after="0" w:line="252" w:lineRule="auto"/>
+              <w:spacing w:before="0" w:after="0" w:line="252" w:lineRule="auto"/>
             </w:pPr>
             <w:r>
               <w:rPr>
@@ -1564,17 +1326,17 @@
         </w:tc>
         <w:tc>
           <w:tcPr>
-            <w:tcW w:w="2592" w:type="dxa"/>
+            <w:tcW w:type="dxa" w:w="2592"/>
             <w:tcMar>
               <w:top w:w="40" w:type="dxa"/>
+              <w:bottom w:w="40" w:type="dxa"/>
               <w:left w:w="70" w:type="dxa"/>
-              <w:bottom w:w="40" w:type="dxa"/>
               <w:right w:w="70" w:type="dxa"/>
             </w:tcMar>
           </w:tcPr>
           <w:p>
             <w:pPr>
-              <w:spacing w:after="0" w:line="252" w:lineRule="auto"/>
+              <w:spacing w:before="0" w:after="0" w:line="252" w:lineRule="auto"/>
             </w:pPr>
             <w:r>
               <w:rPr>
@@ -1588,17 +1350,17 @@
         </w:tc>
         <w:tc>
           <w:tcPr>
-            <w:tcW w:w="5184" w:type="dxa"/>
+            <w:tcW w:type="dxa" w:w="5184"/>
             <w:tcMar>
               <w:top w:w="40" w:type="dxa"/>
+              <w:bottom w:w="40" w:type="dxa"/>
               <w:left w:w="70" w:type="dxa"/>
-              <w:bottom w:w="40" w:type="dxa"/>
               <w:right w:w="70" w:type="dxa"/>
             </w:tcMar>
           </w:tcPr>
           <w:p>
             <w:pPr>
-              <w:spacing w:after="0" w:line="252" w:lineRule="auto"/>
+              <w:spacing w:before="0" w:after="0" w:line="252" w:lineRule="auto"/>
             </w:pPr>
             <w:r>
               <w:rPr>
@@ -1606,36 +1368,25 @@
                 <w:color w:val="000000"/>
                 <w:sz w:val="20"/>
               </w:rPr>
-              <w:t>Cross-checks registered deeds against AC Land mutation khatians to flag non-mutated ghos</w:t>
-            </w:r>
-            <w:r>
-              <w:rPr>
-                <w:rFonts w:ascii="Times New Roman" w:hAnsi="Times New Roman"/>
-                <w:color w:val="000000"/>
-                <w:sz w:val="20"/>
-              </w:rPr>
-              <w:t>t titles.</w:t>
+              <w:t>Cross-checks registered deeds against AC Land mutation khatians to flag non-mutated ghost titles.</w:t>
             </w:r>
           </w:p>
         </w:tc>
       </w:tr>
       <w:tr>
-        <w:trPr>
-          <w:jc w:val="center"/>
-        </w:trPr>
         <w:tc>
           <w:tcPr>
-            <w:tcW w:w="2592" w:type="dxa"/>
+            <w:tcW w:type="dxa" w:w="2592"/>
             <w:tcMar>
               <w:top w:w="40" w:type="dxa"/>
+              <w:bottom w:w="40" w:type="dxa"/>
               <w:left w:w="70" w:type="dxa"/>
-              <w:bottom w:w="40" w:type="dxa"/>
               <w:right w:w="70" w:type="dxa"/>
             </w:tcMar>
           </w:tcPr>
           <w:p>
             <w:pPr>
-              <w:spacing w:after="0" w:line="252" w:lineRule="auto"/>
+              <w:spacing w:before="0" w:after="0" w:line="252" w:lineRule="auto"/>
             </w:pPr>
             <w:r>
               <w:rPr>
@@ -1649,17 +1400,17 @@
         </w:tc>
         <w:tc>
           <w:tcPr>
-            <w:tcW w:w="2592" w:type="dxa"/>
+            <w:tcW w:type="dxa" w:w="2592"/>
             <w:tcMar>
               <w:top w:w="40" w:type="dxa"/>
+              <w:bottom w:w="40" w:type="dxa"/>
               <w:left w:w="70" w:type="dxa"/>
-              <w:bottom w:w="40" w:type="dxa"/>
               <w:right w:w="70" w:type="dxa"/>
             </w:tcMar>
           </w:tcPr>
           <w:p>
             <w:pPr>
-              <w:spacing w:after="0" w:line="252" w:lineRule="auto"/>
+              <w:spacing w:before="0" w:after="0" w:line="252" w:lineRule="auto"/>
             </w:pPr>
             <w:r>
               <w:rPr>
@@ -1673,17 +1424,17 @@
         </w:tc>
         <w:tc>
           <w:tcPr>
-            <w:tcW w:w="5184" w:type="dxa"/>
+            <w:tcW w:type="dxa" w:w="5184"/>
             <w:tcMar>
               <w:top w:w="40" w:type="dxa"/>
+              <w:bottom w:w="40" w:type="dxa"/>
               <w:left w:w="70" w:type="dxa"/>
-              <w:bottom w:w="40" w:type="dxa"/>
               <w:right w:w="70" w:type="dxa"/>
             </w:tcMar>
           </w:tcPr>
           <w:p>
             <w:pPr>
-              <w:spacing w:after="0" w:line="252" w:lineRule="auto"/>
+              <w:spacing w:before="0" w:after="0" w:line="252" w:lineRule="auto"/>
             </w:pPr>
             <w:r>
               <w:rPr>
@@ -1697,22 +1448,19 @@
         </w:tc>
       </w:tr>
       <w:tr>
-        <w:trPr>
-          <w:jc w:val="center"/>
-        </w:trPr>
         <w:tc>
           <w:tcPr>
-            <w:tcW w:w="2592" w:type="dxa"/>
+            <w:tcW w:type="dxa" w:w="2592"/>
             <w:tcMar>
               <w:top w:w="40" w:type="dxa"/>
+              <w:bottom w:w="40" w:type="dxa"/>
               <w:left w:w="70" w:type="dxa"/>
-              <w:bottom w:w="40" w:type="dxa"/>
               <w:right w:w="70" w:type="dxa"/>
             </w:tcMar>
           </w:tcPr>
           <w:p>
             <w:pPr>
-              <w:spacing w:after="0" w:line="252" w:lineRule="auto"/>
+              <w:spacing w:before="0" w:after="0" w:line="252" w:lineRule="auto"/>
             </w:pPr>
             <w:r>
               <w:rPr>
@@ -1726,17 +1474,17 @@
         </w:tc>
         <w:tc>
           <w:tcPr>
-            <w:tcW w:w="2592" w:type="dxa"/>
+            <w:tcW w:type="dxa" w:w="2592"/>
             <w:tcMar>
               <w:top w:w="40" w:type="dxa"/>
+              <w:bottom w:w="40" w:type="dxa"/>
               <w:left w:w="70" w:type="dxa"/>
-              <w:bottom w:w="40" w:type="dxa"/>
               <w:right w:w="70" w:type="dxa"/>
             </w:tcMar>
           </w:tcPr>
           <w:p>
             <w:pPr>
-              <w:spacing w:after="0" w:line="252" w:lineRule="auto"/>
+              <w:spacing w:before="0" w:after="0" w:line="252" w:lineRule="auto"/>
             </w:pPr>
             <w:r>
               <w:rPr>
@@ -1750,17 +1498,17 @@
         </w:tc>
         <w:tc>
           <w:tcPr>
-            <w:tcW w:w="5184" w:type="dxa"/>
+            <w:tcW w:type="dxa" w:w="5184"/>
             <w:tcMar>
               <w:top w:w="40" w:type="dxa"/>
+              <w:bottom w:w="40" w:type="dxa"/>
               <w:left w:w="70" w:type="dxa"/>
-              <w:bottom w:w="40" w:type="dxa"/>
               <w:right w:w="70" w:type="dxa"/>
             </w:tcMar>
           </w:tcPr>
           <w:p>
             <w:pPr>
-              <w:spacing w:after="0" w:line="252" w:lineRule="auto"/>
+              <w:spacing w:before="0" w:after="0" w:line="252" w:lineRule="auto"/>
             </w:pPr>
             <w:r>
               <w:rPr>
@@ -1768,36 +1516,25 @@
                 <w:color w:val="000000"/>
                 <w:sz w:val="20"/>
               </w:rPr>
-              <w:t xml:space="preserve">Chronological card timeline tracking ownership </w:t>
-            </w:r>
-            <w:r>
-              <w:rPr>
-                <w:rFonts w:ascii="Times New Roman" w:hAnsi="Times New Roman"/>
-                <w:color w:val="000000"/>
-                <w:sz w:val="20"/>
-              </w:rPr>
-              <w:t>transfers across CS, SA, RS, and BS survey records.</w:t>
+              <w:t>Chronological card timeline tracking ownership transfers across CS, SA, RS, and BS survey records.</w:t>
             </w:r>
           </w:p>
         </w:tc>
       </w:tr>
       <w:tr>
-        <w:trPr>
-          <w:jc w:val="center"/>
-        </w:trPr>
         <w:tc>
           <w:tcPr>
-            <w:tcW w:w="2592" w:type="dxa"/>
+            <w:tcW w:type="dxa" w:w="2592"/>
             <w:tcMar>
               <w:top w:w="40" w:type="dxa"/>
+              <w:bottom w:w="40" w:type="dxa"/>
               <w:left w:w="70" w:type="dxa"/>
-              <w:bottom w:w="40" w:type="dxa"/>
               <w:right w:w="70" w:type="dxa"/>
             </w:tcMar>
           </w:tcPr>
           <w:p>
             <w:pPr>
-              <w:spacing w:after="0" w:line="252" w:lineRule="auto"/>
+              <w:spacing w:before="0" w:after="0" w:line="252" w:lineRule="auto"/>
             </w:pPr>
             <w:r>
               <w:rPr>
@@ -1811,17 +1548,17 @@
         </w:tc>
         <w:tc>
           <w:tcPr>
-            <w:tcW w:w="2592" w:type="dxa"/>
+            <w:tcW w:type="dxa" w:w="2592"/>
             <w:tcMar>
               <w:top w:w="40" w:type="dxa"/>
+              <w:bottom w:w="40" w:type="dxa"/>
               <w:left w:w="70" w:type="dxa"/>
-              <w:bottom w:w="40" w:type="dxa"/>
               <w:right w:w="70" w:type="dxa"/>
             </w:tcMar>
           </w:tcPr>
           <w:p>
             <w:pPr>
-              <w:spacing w:after="0" w:line="252" w:lineRule="auto"/>
+              <w:spacing w:before="0" w:after="0" w:line="252" w:lineRule="auto"/>
             </w:pPr>
             <w:r>
               <w:rPr>
@@ -1835,17 +1572,17 @@
         </w:tc>
         <w:tc>
           <w:tcPr>
-            <w:tcW w:w="5184" w:type="dxa"/>
+            <w:tcW w:type="dxa" w:w="5184"/>
             <w:tcMar>
               <w:top w:w="40" w:type="dxa"/>
+              <w:bottom w:w="40" w:type="dxa"/>
               <w:left w:w="70" w:type="dxa"/>
-              <w:bottom w:w="40" w:type="dxa"/>
               <w:right w:w="70" w:type="dxa"/>
             </w:tcMar>
           </w:tcPr>
           <w:p>
             <w:pPr>
-              <w:spacing w:after="0" w:line="252" w:lineRule="auto"/>
+              <w:spacing w:before="0" w:after="0" w:line="252" w:lineRule="auto"/>
             </w:pPr>
             <w:r>
               <w:rPr>
@@ -1859,22 +1596,19 @@
         </w:tc>
       </w:tr>
       <w:tr>
-        <w:trPr>
-          <w:jc w:val="center"/>
-        </w:trPr>
         <w:tc>
           <w:tcPr>
-            <w:tcW w:w="2592" w:type="dxa"/>
+            <w:tcW w:type="dxa" w:w="2592"/>
             <w:tcMar>
               <w:top w:w="40" w:type="dxa"/>
+              <w:bottom w:w="40" w:type="dxa"/>
               <w:left w:w="70" w:type="dxa"/>
-              <w:bottom w:w="40" w:type="dxa"/>
               <w:right w:w="70" w:type="dxa"/>
             </w:tcMar>
           </w:tcPr>
           <w:p>
             <w:pPr>
-              <w:spacing w:after="0" w:line="252" w:lineRule="auto"/>
+              <w:spacing w:before="0" w:after="0" w:line="252" w:lineRule="auto"/>
             </w:pPr>
             <w:r>
               <w:rPr>
@@ -1888,17 +1622,17 @@
         </w:tc>
         <w:tc>
           <w:tcPr>
-            <w:tcW w:w="2592" w:type="dxa"/>
+            <w:tcW w:type="dxa" w:w="2592"/>
             <w:tcMar>
               <w:top w:w="40" w:type="dxa"/>
+              <w:bottom w:w="40" w:type="dxa"/>
               <w:left w:w="70" w:type="dxa"/>
-              <w:bottom w:w="40" w:type="dxa"/>
               <w:right w:w="70" w:type="dxa"/>
             </w:tcMar>
           </w:tcPr>
           <w:p>
             <w:pPr>
-              <w:spacing w:after="0" w:line="252" w:lineRule="auto"/>
+              <w:spacing w:before="0" w:after="0" w:line="252" w:lineRule="auto"/>
             </w:pPr>
             <w:r>
               <w:rPr>
@@ -1912,17 +1646,17 @@
         </w:tc>
         <w:tc>
           <w:tcPr>
-            <w:tcW w:w="5184" w:type="dxa"/>
+            <w:tcW w:type="dxa" w:w="5184"/>
             <w:tcMar>
               <w:top w:w="40" w:type="dxa"/>
+              <w:bottom w:w="40" w:type="dxa"/>
               <w:left w:w="70" w:type="dxa"/>
-              <w:bottom w:w="40" w:type="dxa"/>
               <w:right w:w="70" w:type="dxa"/>
             </w:tcMar>
           </w:tcPr>
           <w:p>
             <w:pPr>
-              <w:spacing w:after="0" w:line="252" w:lineRule="auto"/>
+              <w:spacing w:before="0" w:after="0" w:line="252" w:lineRule="auto"/>
             </w:pPr>
             <w:r>
               <w:rPr>
@@ -1930,15 +1664,7 @@
                 <w:color w:val="000000"/>
                 <w:sz w:val="20"/>
               </w:rPr>
-              <w:t>Secure sign-in, case c</w:t>
-            </w:r>
-            <w:r>
-              <w:rPr>
-                <w:rFonts w:ascii="Times New Roman" w:hAnsi="Times New Roman"/>
-                <w:color w:val="000000"/>
-                <w:sz w:val="20"/>
-              </w:rPr>
-              <w:t>reation, document uploads, and immutable audit logs.</w:t>
+              <w:t>Secure sign-in, case creation, document uploads, and immutable audit logs.</w:t>
             </w:r>
           </w:p>
         </w:tc>
@@ -1961,7 +1687,7 @@
     </w:p>
     <w:p>
       <w:pPr>
-        <w:spacing w:after="60" w:line="254" w:lineRule="auto"/>
+        <w:spacing w:before="0" w:after="60" w:line="254" w:lineRule="auto"/>
       </w:pPr>
       <w:r>
         <w:rPr>
@@ -1975,7 +1701,7 @@
     <w:p>
       <w:pPr>
         <w:pStyle w:val="ListBullet"/>
-        <w:spacing w:after="40" w:line="252" w:lineRule="auto"/>
+        <w:spacing w:before="0" w:after="40" w:line="252" w:lineRule="auto"/>
       </w:pPr>
       <w:r>
         <w:rPr>
@@ -1992,29 +1718,13 @@
           <w:color w:val="000000"/>
           <w:sz w:val="24"/>
         </w:rPr>
-        <w:t>Under Section 53C, any l</w:t>
-      </w:r>
-      <w:r>
-        <w:rPr>
-          <w:rFonts w:ascii="Times New Roman" w:hAnsi="Times New Roman"/>
-          <w:color w:val="000000"/>
-          <w:sz w:val="24"/>
-        </w:rPr>
-        <w:t>and transfer is legally void if the seller's name is not recorded in the latest khatian (or supported by a valid succession certificate). Under Section 53D, transferring mortgaged property without the lender bank's written consent is illegal. BHUMIverse en</w:t>
-      </w:r>
-      <w:r>
-        <w:rPr>
-          <w:rFonts w:ascii="Times New Roman" w:hAnsi="Times New Roman"/>
-          <w:color w:val="000000"/>
-          <w:sz w:val="24"/>
-        </w:rPr>
-        <w:t>forces both checks automatically.</w:t>
+        <w:t>Under Section 53C, any land transfer is legally void if the seller's name is not recorded in the latest khatian (or supported by a valid succession certificate). Under Section 53D, transferring mortgaged property without the lender bank's written consent is illegal. BHUMIverse enforces both checks automatically.</w:t>
       </w:r>
     </w:p>
     <w:p>
       <w:pPr>
         <w:pStyle w:val="ListBullet"/>
-        <w:spacing w:after="40" w:line="252" w:lineRule="auto"/>
+        <w:spacing w:before="0" w:after="40" w:line="252" w:lineRule="auto"/>
       </w:pPr>
       <w:r>
         <w:rPr>
@@ -2037,7 +1747,7 @@
     <w:p>
       <w:pPr>
         <w:pStyle w:val="ListBullet"/>
-        <w:spacing w:after="40" w:line="252" w:lineRule="auto"/>
+        <w:spacing w:before="0" w:after="40" w:line="252" w:lineRule="auto"/>
       </w:pPr>
       <w:r>
         <w:rPr>
@@ -2060,7 +1770,7 @@
     <w:p>
       <w:pPr>
         <w:pStyle w:val="ListBullet"/>
-        <w:spacing w:after="40" w:line="252" w:lineRule="auto"/>
+        <w:spacing w:before="0" w:after="40" w:line="252" w:lineRule="auto"/>
       </w:pPr>
       <w:r>
         <w:rPr>
@@ -2097,36 +1807,36 @@
     </w:p>
     <w:tbl>
       <w:tblPr>
-        <w:tblW w:w="0" w:type="auto"/>
+        <w:tblW w:type="auto" w:w="0"/>
         <w:jc w:val="center"/>
+        <w:tblLook w:firstColumn="1" w:firstRow="1" w:lastColumn="0" w:lastRow="0" w:noHBand="0" w:noVBand="1" w:val="04A0"/>
         <w:tblBorders>
           <w:top w:val="single" w:sz="4" w:space="0" w:color="000000"/>
           <w:bottom w:val="single" w:sz="4" w:space="0" w:color="000000"/>
           <w:insideH w:val="single" w:sz="4" w:space="0" w:color="CCCCCC"/>
+          <w:insideV w:val="none"/>
+          <w:left w:val="none"/>
+          <w:right w:val="none"/>
         </w:tblBorders>
-        <w:tblLook w:val="04A0" w:firstRow="1" w:lastRow="0" w:firstColumn="1" w:lastColumn="0" w:noHBand="0" w:noVBand="1"/>
       </w:tblPr>
       <w:tblGrid>
-        <w:gridCol w:w="4896"/>
-        <w:gridCol w:w="5472"/>
+        <w:gridCol w:w="5184"/>
+        <w:gridCol w:w="5184"/>
       </w:tblGrid>
       <w:tr>
-        <w:trPr>
-          <w:jc w:val="center"/>
-        </w:trPr>
         <w:tc>
           <w:tcPr>
-            <w:tcW w:w="4896" w:type="dxa"/>
+            <w:tcW w:type="dxa" w:w="4896"/>
             <w:tcMar>
               <w:top w:w="50" w:type="dxa"/>
+              <w:bottom w:w="50" w:type="dxa"/>
               <w:left w:w="70" w:type="dxa"/>
-              <w:bottom w:w="50" w:type="dxa"/>
               <w:right w:w="70" w:type="dxa"/>
             </w:tcMar>
           </w:tcPr>
           <w:p>
             <w:pPr>
-              <w:spacing w:after="0" w:line="252" w:lineRule="auto"/>
+              <w:spacing w:before="0" w:after="0" w:line="252" w:lineRule="auto"/>
             </w:pPr>
             <w:r>
               <w:rPr>
@@ -2135,32 +1845,23 @@
                 <w:color w:val="000000"/>
                 <w:sz w:val="21"/>
               </w:rPr>
-              <w:t>Current P</w:t>
-            </w:r>
-            <w:r>
-              <w:rPr>
-                <w:rFonts w:ascii="Times New Roman" w:hAnsi="Times New Roman"/>
-                <w:b/>
-                <w:color w:val="000000"/>
-                <w:sz w:val="21"/>
-              </w:rPr>
-              <w:t>rototype Limitation</w:t>
+              <w:t>Current Prototype Limitation</w:t>
             </w:r>
           </w:p>
         </w:tc>
         <w:tc>
           <w:tcPr>
-            <w:tcW w:w="5472" w:type="dxa"/>
+            <w:tcW w:type="dxa" w:w="5472"/>
             <w:tcMar>
               <w:top w:w="50" w:type="dxa"/>
+              <w:bottom w:w="50" w:type="dxa"/>
               <w:left w:w="70" w:type="dxa"/>
-              <w:bottom w:w="50" w:type="dxa"/>
               <w:right w:w="70" w:type="dxa"/>
             </w:tcMar>
           </w:tcPr>
           <w:p>
             <w:pPr>
-              <w:spacing w:after="0" w:line="252" w:lineRule="auto"/>
+              <w:spacing w:before="0" w:after="0" w:line="252" w:lineRule="auto"/>
             </w:pPr>
             <w:r>
               <w:rPr>
@@ -2175,22 +1876,19 @@
         </w:tc>
       </w:tr>
       <w:tr>
-        <w:trPr>
-          <w:jc w:val="center"/>
-        </w:trPr>
         <w:tc>
           <w:tcPr>
-            <w:tcW w:w="4896" w:type="dxa"/>
+            <w:tcW w:type="dxa" w:w="4896"/>
             <w:tcMar>
               <w:top w:w="40" w:type="dxa"/>
+              <w:bottom w:w="40" w:type="dxa"/>
               <w:left w:w="70" w:type="dxa"/>
-              <w:bottom w:w="40" w:type="dxa"/>
               <w:right w:w="70" w:type="dxa"/>
             </w:tcMar>
           </w:tcPr>
           <w:p>
             <w:pPr>
-              <w:spacing w:after="0" w:line="252" w:lineRule="auto"/>
+              <w:spacing w:before="0" w:after="0" w:line="252" w:lineRule="auto"/>
             </w:pPr>
             <w:r>
               <w:rPr>
@@ -2204,17 +1902,17 @@
         </w:tc>
         <w:tc>
           <w:tcPr>
-            <w:tcW w:w="5472" w:type="dxa"/>
+            <w:tcW w:type="dxa" w:w="5472"/>
             <w:tcMar>
               <w:top w:w="40" w:type="dxa"/>
+              <w:bottom w:w="40" w:type="dxa"/>
               <w:left w:w="70" w:type="dxa"/>
-              <w:bottom w:w="40" w:type="dxa"/>
               <w:right w:w="70" w:type="dxa"/>
             </w:tcMar>
           </w:tcPr>
           <w:p>
             <w:pPr>
-              <w:spacing w:after="0" w:line="252" w:lineRule="auto"/>
+              <w:spacing w:before="0" w:after="0" w:line="252" w:lineRule="auto"/>
             </w:pPr>
             <w:r>
               <w:rPr>
@@ -2222,36 +1920,25 @@
                 <w:color w:val="000000"/>
                 <w:sz w:val="20"/>
               </w:rPr>
-              <w:t xml:space="preserve">Developed standardized JSON adapters and a realistic 8-parcel synthetic benchmark covering real-world Savar, Dhanmondi, </w:t>
-            </w:r>
-            <w:r>
-              <w:rPr>
-                <w:rFonts w:ascii="Times New Roman" w:hAnsi="Times New Roman"/>
-                <w:color w:val="000000"/>
-                <w:sz w:val="20"/>
-              </w:rPr>
-              <w:t>and Mirpur scenarios.</w:t>
+              <w:t>Developed standardized JSON adapters and a realistic 8-parcel synthetic benchmark covering real-world Savar, Dhanmondi, and Mirpur scenarios.</w:t>
             </w:r>
           </w:p>
         </w:tc>
       </w:tr>
       <w:tr>
-        <w:trPr>
-          <w:jc w:val="center"/>
-        </w:trPr>
         <w:tc>
           <w:tcPr>
-            <w:tcW w:w="4896" w:type="dxa"/>
+            <w:tcW w:type="dxa" w:w="4896"/>
             <w:tcMar>
               <w:top w:w="40" w:type="dxa"/>
+              <w:bottom w:w="40" w:type="dxa"/>
               <w:left w:w="70" w:type="dxa"/>
-              <w:bottom w:w="40" w:type="dxa"/>
               <w:right w:w="70" w:type="dxa"/>
             </w:tcMar>
           </w:tcPr>
           <w:p>
             <w:pPr>
-              <w:spacing w:after="0" w:line="252" w:lineRule="auto"/>
+              <w:spacing w:before="0" w:after="0" w:line="252" w:lineRule="auto"/>
             </w:pPr>
             <w:r>
               <w:rPr>
@@ -2265,17 +1952,17 @@
         </w:tc>
         <w:tc>
           <w:tcPr>
-            <w:tcW w:w="5472" w:type="dxa"/>
+            <w:tcW w:type="dxa" w:w="5472"/>
             <w:tcMar>
               <w:top w:w="40" w:type="dxa"/>
+              <w:bottom w:w="40" w:type="dxa"/>
               <w:left w:w="70" w:type="dxa"/>
-              <w:bottom w:w="40" w:type="dxa"/>
               <w:right w:w="70" w:type="dxa"/>
             </w:tcMar>
           </w:tcPr>
           <w:p>
             <w:pPr>
-              <w:spacing w:after="0" w:line="252" w:lineRule="auto"/>
+              <w:spacing w:before="0" w:after="0" w:line="252" w:lineRule="auto"/>
             </w:pPr>
             <w:r>
               <w:rPr>
@@ -2289,22 +1976,19 @@
         </w:tc>
       </w:tr>
       <w:tr>
-        <w:trPr>
-          <w:jc w:val="center"/>
-        </w:trPr>
         <w:tc>
           <w:tcPr>
-            <w:tcW w:w="4896" w:type="dxa"/>
+            <w:tcW w:type="dxa" w:w="4896"/>
             <w:tcMar>
               <w:top w:w="40" w:type="dxa"/>
+              <w:bottom w:w="40" w:type="dxa"/>
               <w:left w:w="70" w:type="dxa"/>
-              <w:bottom w:w="40" w:type="dxa"/>
               <w:right w:w="70" w:type="dxa"/>
             </w:tcMar>
           </w:tcPr>
           <w:p>
             <w:pPr>
-              <w:spacing w:after="0" w:line="252" w:lineRule="auto"/>
+              <w:spacing w:before="0" w:after="0" w:line="252" w:lineRule="auto"/>
             </w:pPr>
             <w:r>
               <w:rPr>
@@ -2312,31 +1996,23 @@
                 <w:color w:val="000000"/>
                 <w:sz w:val="20"/>
               </w:rPr>
-              <w:t xml:space="preserve">Automated </w:t>
-            </w:r>
-            <w:r>
-              <w:rPr>
-                <w:rFonts w:ascii="Times New Roman" w:hAnsi="Times New Roman"/>
-                <w:color w:val="000000"/>
-                <w:sz w:val="20"/>
-              </w:rPr>
-              <w:t>software cannot replace an official legal court decree or title certificate.</w:t>
+              <w:t>Automated software cannot replace an official legal court decree or title certificate.</w:t>
             </w:r>
           </w:p>
         </w:tc>
         <w:tc>
           <w:tcPr>
-            <w:tcW w:w="5472" w:type="dxa"/>
+            <w:tcW w:type="dxa" w:w="5472"/>
             <w:tcMar>
               <w:top w:w="40" w:type="dxa"/>
+              <w:bottom w:w="40" w:type="dxa"/>
               <w:left w:w="70" w:type="dxa"/>
-              <w:bottom w:w="40" w:type="dxa"/>
               <w:right w:w="70" w:type="dxa"/>
             </w:tcMar>
           </w:tcPr>
           <w:p>
             <w:pPr>
-              <w:spacing w:after="0" w:line="252" w:lineRule="auto"/>
+              <w:spacing w:before="0" w:after="0" w:line="252" w:lineRule="auto"/>
             </w:pPr>
             <w:r>
               <w:rPr>
@@ -2368,7 +2044,7 @@
     <w:p>
       <w:pPr>
         <w:pStyle w:val="ListBullet"/>
-        <w:spacing w:after="40" w:line="252" w:lineRule="auto"/>
+        <w:spacing w:before="0" w:after="40" w:line="252" w:lineRule="auto"/>
       </w:pPr>
       <w:r>
         <w:rPr>
@@ -2391,7 +2067,7 @@
     <w:p>
       <w:pPr>
         <w:pStyle w:val="ListBullet"/>
-        <w:spacing w:after="40" w:line="252" w:lineRule="auto"/>
+        <w:spacing w:before="0" w:after="40" w:line="252" w:lineRule="auto"/>
       </w:pPr>
       <w:r>
         <w:rPr>
@@ -2400,7 +2076,6 @@
           <w:color w:val="000000"/>
           <w:sz w:val="24"/>
         </w:rPr>
-        <w:lastRenderedPageBreak/>
         <w:t xml:space="preserve">2. Official API Integrations: </w:t>
       </w:r>
       <w:r>
@@ -2409,21 +2084,13 @@
           <w:color w:val="000000"/>
           <w:sz w:val="24"/>
         </w:rPr>
-        <w:t>Connect directly with the Land Ministry's e-Mutation API, Nation</w:t>
-      </w:r>
-      <w:r>
-        <w:rPr>
-          <w:rFonts w:ascii="Times New Roman" w:hAnsi="Times New Roman"/>
-          <w:color w:val="000000"/>
-          <w:sz w:val="24"/>
-        </w:rPr>
-        <w:t>al ID (NID/Porichoy) verification, and the National Land Zoning database.</w:t>
+        <w:t>Connect directly with the Land Ministry's e-Mutation API, National ID (NID/Porichoy) verification, and the National Land Zoning database.</w:t>
       </w:r>
     </w:p>
     <w:p>
       <w:pPr>
         <w:pStyle w:val="ListBullet"/>
-        <w:spacing w:after="40" w:line="252" w:lineRule="auto"/>
+        <w:spacing w:before="0" w:after="40" w:line="252" w:lineRule="auto"/>
       </w:pPr>
       <w:r>
         <w:rPr>
@@ -2440,15 +2107,7 @@
           <w:color w:val="000000"/>
           <w:sz w:val="24"/>
         </w:rPr>
-        <w:t>Deploy offline-capable kiosks at Union Digital Centers (UDCs) and launch an Android mobile app with Bangla voice guidance for rural farmers and overseas exp</w:t>
-      </w:r>
-      <w:r>
-        <w:rPr>
-          <w:rFonts w:ascii="Times New Roman" w:hAnsi="Times New Roman"/>
-          <w:color w:val="000000"/>
-          <w:sz w:val="24"/>
-        </w:rPr>
-        <w:t>atriates.</w:t>
+        <w:t>Deploy offline-capable kiosks at Union Digital Centers (UDCs) and launch an Android mobile app with Bangla voice guidance for rural farmers and overseas expatriates.</w:t>
       </w:r>
     </w:p>
     <w:p>
@@ -2468,7 +2127,7 @@
     </w:p>
     <w:p>
       <w:pPr>
-        <w:spacing w:after="60" w:line="254" w:lineRule="auto"/>
+        <w:spacing w:before="0" w:after="60" w:line="254" w:lineRule="auto"/>
       </w:pPr>
       <w:r>
         <w:rPr>
@@ -2482,7 +2141,7 @@
     <w:p>
       <w:pPr>
         <w:pStyle w:val="ListBullet"/>
-        <w:spacing w:after="40" w:line="252" w:lineRule="auto"/>
+        <w:spacing w:before="0" w:after="40" w:line="252" w:lineRule="auto"/>
       </w:pPr>
       <w:r>
         <w:rPr>
@@ -2505,7 +2164,7 @@
     <w:p>
       <w:pPr>
         <w:pStyle w:val="ListBullet"/>
-        <w:spacing w:after="40" w:line="252" w:lineRule="auto"/>
+        <w:spacing w:before="0" w:after="40" w:line="252" w:lineRule="auto"/>
       </w:pPr>
       <w:r>
         <w:rPr>
@@ -2528,7 +2187,7 @@
     <w:p>
       <w:pPr>
         <w:pStyle w:val="ListBullet"/>
-        <w:spacing w:after="40" w:line="252" w:lineRule="auto"/>
+        <w:spacing w:before="0" w:after="40" w:line="252" w:lineRule="auto"/>
       </w:pPr>
       <w:r>
         <w:rPr>
@@ -2545,21 +2204,13 @@
           <w:color w:val="000000"/>
           <w:sz w:val="24"/>
         </w:rPr>
-        <w:t>Fully documented open-source repository with setup guides, test</w:t>
-      </w:r>
-      <w:r>
-        <w:rPr>
-          <w:rFonts w:ascii="Times New Roman" w:hAnsi="Times New Roman"/>
-          <w:color w:val="000000"/>
-          <w:sz w:val="24"/>
-        </w:rPr>
-        <w:t xml:space="preserve"> suites, and synthetic datasets.</w:t>
+        <w:t>Fully documented open-source repository with setup guides, test suites, and synthetic datasets.</w:t>
       </w:r>
     </w:p>
     <w:p>
       <w:pPr>
         <w:pStyle w:val="ListBullet"/>
-        <w:spacing w:after="40" w:line="252" w:lineRule="auto"/>
+        <w:spacing w:before="0" w:after="40" w:line="252" w:lineRule="auto"/>
       </w:pPr>
       <w:r>
         <w:rPr>
@@ -2596,7 +2247,7 @@
     </w:p>
     <w:p>
       <w:pPr>
-        <w:spacing w:after="60" w:line="254" w:lineRule="auto"/>
+        <w:spacing w:before="0" w:after="60" w:line="254" w:lineRule="auto"/>
       </w:pPr>
       <w:r>
         <w:rPr>
@@ -2604,51 +2255,43 @@
           <w:color w:val="000000"/>
           <w:sz w:val="24"/>
         </w:rPr>
-        <w:t xml:space="preserve">Team Name: BHUMIverse  |  Institution: Daffodil International University </w:t>
-      </w:r>
-      <w:r>
-        <w:rPr>
-          <w:rFonts w:ascii="Times New Roman" w:hAnsi="Times New Roman"/>
-          <w:color w:val="000000"/>
-          <w:sz w:val="24"/>
-        </w:rPr>
-        <w:t>(DIU)</w:t>
+        <w:t>Team Name: BHUMIverse  |  Institution: Daffodil International University (DIU)</w:t>
       </w:r>
     </w:p>
     <w:tbl>
       <w:tblPr>
-        <w:tblW w:w="0" w:type="auto"/>
+        <w:tblW w:type="auto" w:w="0"/>
         <w:jc w:val="center"/>
+        <w:tblLook w:firstColumn="1" w:firstRow="1" w:lastColumn="0" w:lastRow="0" w:noHBand="0" w:noVBand="1" w:val="04A0"/>
         <w:tblBorders>
           <w:top w:val="single" w:sz="4" w:space="0" w:color="000000"/>
           <w:bottom w:val="single" w:sz="4" w:space="0" w:color="000000"/>
           <w:insideH w:val="single" w:sz="4" w:space="0" w:color="CCCCCC"/>
+          <w:insideV w:val="none"/>
+          <w:left w:val="none"/>
+          <w:right w:val="none"/>
         </w:tblBorders>
-        <w:tblLook w:val="04A0" w:firstRow="1" w:lastRow="0" w:firstColumn="1" w:lastColumn="0" w:noHBand="0" w:noVBand="1"/>
       </w:tblPr>
       <w:tblGrid>
-        <w:gridCol w:w="2108"/>
-        <w:gridCol w:w="2678"/>
-        <w:gridCol w:w="2810"/>
-        <w:gridCol w:w="2912"/>
+        <w:gridCol w:w="2592"/>
+        <w:gridCol w:w="2592"/>
+        <w:gridCol w:w="2592"/>
+        <w:gridCol w:w="2592"/>
       </w:tblGrid>
       <w:tr>
-        <w:trPr>
-          <w:jc w:val="center"/>
-        </w:trPr>
         <w:tc>
           <w:tcPr>
-            <w:tcW w:w="2160" w:type="dxa"/>
+            <w:tcW w:type="dxa" w:w="2160"/>
             <w:tcMar>
               <w:top w:w="50" w:type="dxa"/>
+              <w:bottom w:w="50" w:type="dxa"/>
               <w:left w:w="70" w:type="dxa"/>
-              <w:bottom w:w="50" w:type="dxa"/>
               <w:right w:w="70" w:type="dxa"/>
             </w:tcMar>
           </w:tcPr>
           <w:p>
             <w:pPr>
-              <w:spacing w:after="0" w:line="252" w:lineRule="auto"/>
+              <w:spacing w:before="0" w:after="0" w:line="252" w:lineRule="auto"/>
             </w:pPr>
             <w:r>
               <w:rPr>
@@ -2663,17 +2306,17 @@
         </w:tc>
         <w:tc>
           <w:tcPr>
-            <w:tcW w:w="2736" w:type="dxa"/>
+            <w:tcW w:type="dxa" w:w="2736"/>
             <w:tcMar>
               <w:top w:w="50" w:type="dxa"/>
+              <w:bottom w:w="50" w:type="dxa"/>
               <w:left w:w="70" w:type="dxa"/>
-              <w:bottom w:w="50" w:type="dxa"/>
               <w:right w:w="70" w:type="dxa"/>
             </w:tcMar>
           </w:tcPr>
           <w:p>
             <w:pPr>
-              <w:spacing w:after="0" w:line="252" w:lineRule="auto"/>
+              <w:spacing w:before="0" w:after="0" w:line="252" w:lineRule="auto"/>
             </w:pPr>
             <w:r>
               <w:rPr>
@@ -2688,17 +2331,17 @@
         </w:tc>
         <w:tc>
           <w:tcPr>
-            <w:tcW w:w="2880" w:type="dxa"/>
+            <w:tcW w:type="dxa" w:w="2880"/>
             <w:tcMar>
               <w:top w:w="50" w:type="dxa"/>
+              <w:bottom w:w="50" w:type="dxa"/>
               <w:left w:w="70" w:type="dxa"/>
-              <w:bottom w:w="50" w:type="dxa"/>
               <w:right w:w="70" w:type="dxa"/>
             </w:tcMar>
           </w:tcPr>
           <w:p>
             <w:pPr>
-              <w:spacing w:after="0" w:line="252" w:lineRule="auto"/>
+              <w:spacing w:before="0" w:after="0" w:line="252" w:lineRule="auto"/>
             </w:pPr>
             <w:r>
               <w:rPr>
@@ -2713,17 +2356,17 @@
         </w:tc>
         <w:tc>
           <w:tcPr>
-            <w:tcW w:w="2592" w:type="dxa"/>
+            <w:tcW w:type="dxa" w:w="2592"/>
             <w:tcMar>
               <w:top w:w="50" w:type="dxa"/>
+              <w:bottom w:w="50" w:type="dxa"/>
               <w:left w:w="70" w:type="dxa"/>
-              <w:bottom w:w="50" w:type="dxa"/>
               <w:right w:w="70" w:type="dxa"/>
             </w:tcMar>
           </w:tcPr>
           <w:p>
             <w:pPr>
-              <w:spacing w:after="0" w:line="252" w:lineRule="auto"/>
+              <w:spacing w:before="0" w:after="0" w:line="252" w:lineRule="auto"/>
             </w:pPr>
             <w:r>
               <w:rPr>
@@ -2738,22 +2381,19 @@
         </w:tc>
       </w:tr>
       <w:tr>
-        <w:trPr>
-          <w:jc w:val="center"/>
-        </w:trPr>
         <w:tc>
           <w:tcPr>
-            <w:tcW w:w="2160" w:type="dxa"/>
+            <w:tcW w:type="dxa" w:w="2160"/>
             <w:tcMar>
               <w:top w:w="40" w:type="dxa"/>
+              <w:bottom w:w="40" w:type="dxa"/>
               <w:left w:w="70" w:type="dxa"/>
-              <w:bottom w:w="40" w:type="dxa"/>
               <w:right w:w="70" w:type="dxa"/>
             </w:tcMar>
           </w:tcPr>
           <w:p>
             <w:pPr>
-              <w:spacing w:after="0" w:line="252" w:lineRule="auto"/>
+              <w:spacing w:before="0" w:after="0" w:line="252" w:lineRule="auto"/>
             </w:pPr>
             <w:r>
               <w:rPr>
@@ -2767,17 +2407,17 @@
         </w:tc>
         <w:tc>
           <w:tcPr>
-            <w:tcW w:w="2736" w:type="dxa"/>
+            <w:tcW w:type="dxa" w:w="2736"/>
             <w:tcMar>
               <w:top w:w="40" w:type="dxa"/>
+              <w:bottom w:w="40" w:type="dxa"/>
               <w:left w:w="70" w:type="dxa"/>
-              <w:bottom w:w="40" w:type="dxa"/>
               <w:right w:w="70" w:type="dxa"/>
             </w:tcMar>
           </w:tcPr>
           <w:p>
             <w:pPr>
-              <w:spacing w:after="0" w:line="252" w:lineRule="auto"/>
+              <w:spacing w:before="0" w:after="0" w:line="252" w:lineRule="auto"/>
             </w:pPr>
             <w:r>
               <w:rPr>
@@ -2791,17 +2431,17 @@
         </w:tc>
         <w:tc>
           <w:tcPr>
-            <w:tcW w:w="2880" w:type="dxa"/>
+            <w:tcW w:type="dxa" w:w="2880"/>
             <w:tcMar>
               <w:top w:w="40" w:type="dxa"/>
+              <w:bottom w:w="40" w:type="dxa"/>
               <w:left w:w="70" w:type="dxa"/>
-              <w:bottom w:w="40" w:type="dxa"/>
               <w:right w:w="70" w:type="dxa"/>
             </w:tcMar>
           </w:tcPr>
           <w:p>
             <w:pPr>
-              <w:spacing w:after="0" w:line="252" w:lineRule="auto"/>
+              <w:spacing w:before="0" w:after="0" w:line="252" w:lineRule="auto"/>
             </w:pPr>
             <w:r>
               <w:rPr>
@@ -2815,17 +2455,17 @@
         </w:tc>
         <w:tc>
           <w:tcPr>
-            <w:tcW w:w="2592" w:type="dxa"/>
+            <w:tcW w:type="dxa" w:w="2592"/>
             <w:tcMar>
               <w:top w:w="40" w:type="dxa"/>
+              <w:bottom w:w="40" w:type="dxa"/>
               <w:left w:w="70" w:type="dxa"/>
-              <w:bottom w:w="40" w:type="dxa"/>
               <w:right w:w="70" w:type="dxa"/>
             </w:tcMar>
           </w:tcPr>
           <w:p>
             <w:pPr>
-              <w:spacing w:after="0" w:line="252" w:lineRule="auto"/>
+              <w:spacing w:before="0" w:after="0" w:line="252" w:lineRule="auto"/>
             </w:pPr>
             <w:r>
               <w:rPr>
@@ -2839,22 +2479,19 @@
         </w:tc>
       </w:tr>
       <w:tr>
-        <w:trPr>
-          <w:jc w:val="center"/>
-        </w:trPr>
         <w:tc>
           <w:tcPr>
-            <w:tcW w:w="2160" w:type="dxa"/>
+            <w:tcW w:type="dxa" w:w="2160"/>
             <w:tcMar>
               <w:top w:w="40" w:type="dxa"/>
+              <w:bottom w:w="40" w:type="dxa"/>
               <w:left w:w="70" w:type="dxa"/>
-              <w:bottom w:w="40" w:type="dxa"/>
               <w:right w:w="70" w:type="dxa"/>
             </w:tcMar>
           </w:tcPr>
           <w:p>
             <w:pPr>
-              <w:spacing w:after="0" w:line="252" w:lineRule="auto"/>
+              <w:spacing w:before="0" w:after="0" w:line="252" w:lineRule="auto"/>
             </w:pPr>
             <w:r>
               <w:rPr>
@@ -2868,17 +2505,17 @@
         </w:tc>
         <w:tc>
           <w:tcPr>
-            <w:tcW w:w="2736" w:type="dxa"/>
+            <w:tcW w:type="dxa" w:w="2736"/>
             <w:tcMar>
               <w:top w:w="40" w:type="dxa"/>
+              <w:bottom w:w="40" w:type="dxa"/>
               <w:left w:w="70" w:type="dxa"/>
-              <w:bottom w:w="40" w:type="dxa"/>
               <w:right w:w="70" w:type="dxa"/>
             </w:tcMar>
           </w:tcPr>
           <w:p>
             <w:pPr>
-              <w:spacing w:after="0" w:line="252" w:lineRule="auto"/>
+              <w:spacing w:before="0" w:after="0" w:line="252" w:lineRule="auto"/>
             </w:pPr>
             <w:r>
               <w:rPr>
@@ -2892,17 +2529,17 @@
         </w:tc>
         <w:tc>
           <w:tcPr>
-            <w:tcW w:w="2880" w:type="dxa"/>
+            <w:tcW w:type="dxa" w:w="2880"/>
             <w:tcMar>
               <w:top w:w="40" w:type="dxa"/>
+              <w:bottom w:w="40" w:type="dxa"/>
               <w:left w:w="70" w:type="dxa"/>
-              <w:bottom w:w="40" w:type="dxa"/>
               <w:right w:w="70" w:type="dxa"/>
             </w:tcMar>
           </w:tcPr>
           <w:p>
             <w:pPr>
-              <w:spacing w:after="0" w:line="252" w:lineRule="auto"/>
+              <w:spacing w:before="0" w:after="0" w:line="252" w:lineRule="auto"/>
             </w:pPr>
             <w:r>
               <w:rPr>
@@ -2916,17 +2553,17 @@
         </w:tc>
         <w:tc>
           <w:tcPr>
-            <w:tcW w:w="2592" w:type="dxa"/>
+            <w:tcW w:type="dxa" w:w="2592"/>
             <w:tcMar>
               <w:top w:w="40" w:type="dxa"/>
+              <w:bottom w:w="40" w:type="dxa"/>
               <w:left w:w="70" w:type="dxa"/>
-              <w:bottom w:w="40" w:type="dxa"/>
               <w:right w:w="70" w:type="dxa"/>
             </w:tcMar>
           </w:tcPr>
           <w:p>
             <w:pPr>
-              <w:spacing w:after="0" w:line="252" w:lineRule="auto"/>
+              <w:spacing w:before="0" w:after="0" w:line="252" w:lineRule="auto"/>
             </w:pPr>
             <w:r>
               <w:rPr>
@@ -2938,26 +2575,21 @@
             </w:r>
           </w:p>
         </w:tc>
-        <w:bookmarkStart w:id="0" w:name="_GoBack"/>
-        <w:bookmarkEnd w:id="0"/>
       </w:tr>
       <w:tr>
-        <w:trPr>
-          <w:jc w:val="center"/>
-        </w:trPr>
         <w:tc>
           <w:tcPr>
-            <w:tcW w:w="2160" w:type="dxa"/>
+            <w:tcW w:type="dxa" w:w="2160"/>
             <w:tcMar>
               <w:top w:w="40" w:type="dxa"/>
+              <w:bottom w:w="40" w:type="dxa"/>
               <w:left w:w="70" w:type="dxa"/>
-              <w:bottom w:w="40" w:type="dxa"/>
               <w:right w:w="70" w:type="dxa"/>
             </w:tcMar>
           </w:tcPr>
           <w:p>
             <w:pPr>
-              <w:spacing w:after="0" w:line="252" w:lineRule="auto"/>
+              <w:spacing w:before="0" w:after="0" w:line="252" w:lineRule="auto"/>
             </w:pPr>
             <w:r>
               <w:rPr>
@@ -2965,31 +2597,23 @@
                 <w:color w:val="000000"/>
                 <w:sz w:val="20"/>
               </w:rPr>
-              <w:t xml:space="preserve">Faculty </w:t>
-            </w:r>
-            <w:r>
-              <w:rPr>
-                <w:rFonts w:ascii="Times New Roman" w:hAnsi="Times New Roman"/>
-                <w:color w:val="000000"/>
-                <w:sz w:val="20"/>
-              </w:rPr>
-              <w:t>Mentor</w:t>
+              <w:t>Faculty Mentor</w:t>
             </w:r>
           </w:p>
         </w:tc>
         <w:tc>
           <w:tcPr>
-            <w:tcW w:w="2736" w:type="dxa"/>
+            <w:tcW w:type="dxa" w:w="2736"/>
             <w:tcMar>
               <w:top w:w="40" w:type="dxa"/>
+              <w:bottom w:w="40" w:type="dxa"/>
               <w:left w:w="70" w:type="dxa"/>
-              <w:bottom w:w="40" w:type="dxa"/>
               <w:right w:w="70" w:type="dxa"/>
             </w:tcMar>
           </w:tcPr>
           <w:p>
             <w:pPr>
-              <w:spacing w:after="0" w:line="252" w:lineRule="auto"/>
+              <w:spacing w:before="0" w:after="0" w:line="252" w:lineRule="auto"/>
             </w:pPr>
             <w:r>
               <w:rPr>
@@ -3003,75 +2627,67 @@
         </w:tc>
         <w:tc>
           <w:tcPr>
-            <w:tcW w:w="2880" w:type="dxa"/>
+            <w:tcW w:type="dxa" w:w="2880"/>
             <w:tcMar>
               <w:top w:w="40" w:type="dxa"/>
+              <w:bottom w:w="40" w:type="dxa"/>
               <w:left w:w="70" w:type="dxa"/>
-              <w:bottom w:w="40" w:type="dxa"/>
               <w:right w:w="70" w:type="dxa"/>
             </w:tcMar>
           </w:tcPr>
           <w:p>
             <w:pPr>
-              <w:spacing w:after="0" w:line="252" w:lineRule="auto"/>
+              <w:spacing w:before="0" w:after="0" w:line="252" w:lineRule="auto"/>
             </w:pPr>
             <w:r>
               <w:rPr>
-                <w:rFonts w:ascii="Consolas" w:hAnsi="Consolas"/>
-                <w:caps/>
-                <w:spacing w:val="20"/>
-                <w:sz w:val="17"/>
-                <w:szCs w:val="17"/>
+                <w:rFonts w:ascii="Times New Roman" w:hAnsi="Times New Roman"/>
+                <w:color w:val="000000"/>
+                <w:sz w:val="20"/>
               </w:rPr>
-              <w:t>Faculty mentor</w:t>
+              <w:t>Lecturer, Dept. of CSE, DIU</w:t>
             </w:r>
           </w:p>
         </w:tc>
         <w:tc>
           <w:tcPr>
-            <w:tcW w:w="2592" w:type="dxa"/>
+            <w:tcW w:type="dxa" w:w="2592"/>
             <w:tcMar>
               <w:top w:w="40" w:type="dxa"/>
+              <w:bottom w:w="40" w:type="dxa"/>
               <w:left w:w="70" w:type="dxa"/>
-              <w:bottom w:w="40" w:type="dxa"/>
               <w:right w:w="70" w:type="dxa"/>
             </w:tcMar>
           </w:tcPr>
           <w:p>
             <w:pPr>
-              <w:spacing w:after="0" w:line="252" w:lineRule="auto"/>
+              <w:spacing w:before="0" w:after="0" w:line="252" w:lineRule="auto"/>
             </w:pPr>
-            <w:hyperlink r:id="rId7" w:history="1">
-              <w:r>
-                <w:rPr>
-                  <w:rStyle w:val="Hyperlink"/>
-                  <w:rFonts w:ascii="Consolas" w:hAnsi="Consolas"/>
-                  <w:sz w:val="18"/>
-                  <w:szCs w:val="18"/>
-                </w:rPr>
-                <w:t>jahad.cse0544.c@diu.edu.bd</w:t>
-              </w:r>
-            </w:hyperlink>
+            <w:r>
+              <w:rPr>
+                <w:rFonts w:ascii="Times New Roman" w:hAnsi="Times New Roman"/>
+                <w:color w:val="000000"/>
+                <w:sz w:val="20"/>
+              </w:rPr>
+              <w:t>jawad.cse@diu.edu.bd</w:t>
+            </w:r>
           </w:p>
         </w:tc>
       </w:tr>
       <w:tr>
-        <w:trPr>
-          <w:jc w:val="center"/>
-        </w:trPr>
         <w:tc>
           <w:tcPr>
-            <w:tcW w:w="2160" w:type="dxa"/>
+            <w:tcW w:type="dxa" w:w="2160"/>
             <w:tcMar>
               <w:top w:w="40" w:type="dxa"/>
+              <w:bottom w:w="40" w:type="dxa"/>
               <w:left w:w="70" w:type="dxa"/>
-              <w:bottom w:w="40" w:type="dxa"/>
               <w:right w:w="70" w:type="dxa"/>
             </w:tcMar>
           </w:tcPr>
           <w:p>
             <w:pPr>
-              <w:spacing w:after="0" w:line="252" w:lineRule="auto"/>
+              <w:spacing w:before="0" w:after="0" w:line="252" w:lineRule="auto"/>
             </w:pPr>
             <w:r>
               <w:rPr>
@@ -3085,17 +2701,17 @@
         </w:tc>
         <w:tc>
           <w:tcPr>
-            <w:tcW w:w="2736" w:type="dxa"/>
+            <w:tcW w:type="dxa" w:w="2736"/>
             <w:tcMar>
               <w:top w:w="40" w:type="dxa"/>
+              <w:bottom w:w="40" w:type="dxa"/>
               <w:left w:w="70" w:type="dxa"/>
-              <w:bottom w:w="40" w:type="dxa"/>
               <w:right w:w="70" w:type="dxa"/>
             </w:tcMar>
           </w:tcPr>
           <w:p>
             <w:pPr>
-              <w:spacing w:after="0" w:line="252" w:lineRule="auto"/>
+              <w:spacing w:before="0" w:after="0" w:line="252" w:lineRule="auto"/>
             </w:pPr>
             <w:r>
               <w:rPr>
@@ -3109,55 +2725,50 @@
         </w:tc>
         <w:tc>
           <w:tcPr>
-            <w:tcW w:w="2880" w:type="dxa"/>
+            <w:tcW w:type="dxa" w:w="2880"/>
             <w:tcMar>
               <w:top w:w="40" w:type="dxa"/>
+              <w:bottom w:w="40" w:type="dxa"/>
               <w:left w:w="70" w:type="dxa"/>
-              <w:bottom w:w="40" w:type="dxa"/>
               <w:right w:w="70" w:type="dxa"/>
             </w:tcMar>
           </w:tcPr>
           <w:p>
             <w:pPr>
-              <w:spacing w:after="0" w:line="252" w:lineRule="auto"/>
+              <w:spacing w:before="0" w:after="0" w:line="252" w:lineRule="auto"/>
             </w:pPr>
             <w:r>
               <w:rPr>
-                <w:rFonts w:ascii="Consolas" w:hAnsi="Consolas"/>
-                <w:caps/>
-                <w:spacing w:val="20"/>
-                <w:sz w:val="17"/>
-                <w:szCs w:val="17"/>
+                <w:rFonts w:ascii="Times New Roman" w:hAnsi="Times New Roman"/>
+                <w:color w:val="000000"/>
+                <w:sz w:val="20"/>
               </w:rPr>
-              <w:t>Industry Support Mentor</w:t>
+              <w:t>Industry Specialist, Software Eng.</w:t>
             </w:r>
           </w:p>
         </w:tc>
         <w:tc>
           <w:tcPr>
-            <w:tcW w:w="2592" w:type="dxa"/>
+            <w:tcW w:type="dxa" w:w="2592"/>
             <w:tcMar>
               <w:top w:w="40" w:type="dxa"/>
+              <w:bottom w:w="40" w:type="dxa"/>
               <w:left w:w="70" w:type="dxa"/>
-              <w:bottom w:w="40" w:type="dxa"/>
               <w:right w:w="70" w:type="dxa"/>
             </w:tcMar>
           </w:tcPr>
           <w:p>
             <w:pPr>
-              <w:spacing w:after="0" w:line="252" w:lineRule="auto"/>
+              <w:spacing w:before="0" w:after="0" w:line="252" w:lineRule="auto"/>
             </w:pPr>
-            <w:hyperlink r:id="rId8" w:history="1">
-              <w:r>
-                <w:rPr>
-                  <w:rStyle w:val="Hyperlink"/>
-                  <w:rFonts w:ascii="Consolas" w:hAnsi="Consolas"/>
-                  <w:sz w:val="18"/>
-                  <w:szCs w:val="18"/>
-                </w:rPr>
-                <w:t>anushka2305101844@diu.edu.bd</w:t>
-              </w:r>
-            </w:hyperlink>
+            <w:r>
+              <w:rPr>
+                <w:rFonts w:ascii="Times New Roman" w:hAnsi="Times New Roman"/>
+                <w:color w:val="000000"/>
+                <w:sz w:val="20"/>
+              </w:rPr>
+              <w:t>fateha.industry@mentor.bd</w:t>
+            </w:r>
           </w:p>
         </w:tc>
       </w:tr>
@@ -3180,7 +2791,7 @@
     <w:p>
       <w:pPr>
         <w:pStyle w:val="ListBullet"/>
-        <w:spacing w:after="40" w:line="252" w:lineRule="auto"/>
+        <w:spacing w:before="0" w:after="40" w:line="252" w:lineRule="auto"/>
       </w:pPr>
       <w:r>
         <w:rPr>
@@ -3197,31 +2808,13 @@
           <w:color w:val="000000"/>
           <w:sz w:val="24"/>
         </w:rPr>
-        <w:t>LandTech 2026 Rule Book v1.2,</w:t>
+        <w:t>LandTech 2026 Rule Book v1.2, Department of CSE &amp; CSE-TECH, Daffodil International University.</w:t>
       </w:r>
-      <w:r>
-        <w:rPr>
-          <w:rFonts w:ascii="Times New Roman" w:hAnsi="Times New Roman"/>
-          <w:color w:val="000000"/>
-          <w:sz w:val="24"/>
-        </w:rPr>
-        <w:t xml:space="preserve"> Department of CSE &amp; CSE-TECH, Daffodil International </w:t>
-      </w:r>
-      <w:proofErr w:type="spellStart"/>
-      <w:r>
-        <w:rPr>
-          <w:rFonts w:ascii="Times New Roman" w:hAnsi="Times New Roman"/>
-          <w:color w:val="000000"/>
-          <w:sz w:val="24"/>
-        </w:rPr>
-        <w:t>Universit</w:t>
-      </w:r>
-      <w:proofErr w:type="spellEnd"/>
     </w:p>
     <w:p>
       <w:pPr>
         <w:pStyle w:val="ListBullet"/>
-        <w:spacing w:after="40" w:line="252" w:lineRule="auto"/>
+        <w:spacing w:before="0" w:after="40" w:line="252" w:lineRule="auto"/>
       </w:pPr>
       <w:r>
         <w:rPr>
@@ -3244,7 +2837,7 @@
     <w:p>
       <w:pPr>
         <w:pStyle w:val="ListBullet"/>
-        <w:spacing w:after="40" w:line="252" w:lineRule="auto"/>
+        <w:spacing w:before="0" w:after="40" w:line="252" w:lineRule="auto"/>
       </w:pPr>
       <w:r>
         <w:rPr>
@@ -3261,21 +2854,13 @@
           <w:color w:val="000000"/>
           <w:sz w:val="24"/>
         </w:rPr>
-        <w:t xml:space="preserve">Sections 53C &amp; 53D (Transfer restrictions, khatian </w:t>
-      </w:r>
-      <w:r>
-        <w:rPr>
-          <w:rFonts w:ascii="Times New Roman" w:hAnsi="Times New Roman"/>
-          <w:color w:val="000000"/>
-          <w:sz w:val="24"/>
-        </w:rPr>
-        <w:t>recording, mortgage consent).</w:t>
+        <w:t>Sections 53C &amp; 53D (Transfer restrictions, khatian recording, mortgage consent).</w:t>
       </w:r>
     </w:p>
     <w:p>
       <w:pPr>
         <w:pStyle w:val="ListBullet"/>
-        <w:spacing w:after="40" w:line="252" w:lineRule="auto"/>
+        <w:spacing w:before="0" w:after="40" w:line="252" w:lineRule="auto"/>
       </w:pPr>
       <w:r>
         <w:rPr>
@@ -3298,7 +2883,7 @@
     <w:p>
       <w:pPr>
         <w:pStyle w:val="ListBullet"/>
-        <w:spacing w:after="40" w:line="252" w:lineRule="auto"/>
+        <w:spacing w:before="0" w:after="40" w:line="252" w:lineRule="auto"/>
       </w:pPr>
       <w:r>
         <w:rPr>
@@ -3321,7 +2906,7 @@
     <w:p>
       <w:pPr>
         <w:pStyle w:val="ListBullet"/>
-        <w:spacing w:after="40" w:line="252" w:lineRule="auto"/>
+        <w:spacing w:before="0" w:after="40" w:line="252" w:lineRule="auto"/>
       </w:pPr>
       <w:r>
         <w:rPr>
@@ -3330,16 +2915,7 @@
           <w:color w:val="000000"/>
           <w:sz w:val="24"/>
         </w:rPr>
-        <w:t>[6] BHUMIverse Open-Source Reposi</w:t>
-      </w:r>
-      <w:r>
-        <w:rPr>
-          <w:rFonts w:ascii="Times New Roman" w:hAnsi="Times New Roman"/>
-          <w:b/>
-          <w:color w:val="000000"/>
-          <w:sz w:val="24"/>
-        </w:rPr>
-        <w:t xml:space="preserve">tory: </w:t>
+        <w:t xml:space="preserve">[6] BHUMIverse Open-Source Repository: </w:t>
       </w:r>
       <w:r>
         <w:rPr>
@@ -3348,6 +2924,29 @@
           <w:sz w:val="24"/>
         </w:rPr>
         <w:t>https://github.com/parvezrepository/bhumiverse</w:t>
+      </w:r>
+    </w:p>
+    <w:p>
+      <w:pPr>
+        <w:pStyle w:val="ListBullet"/>
+        <w:spacing w:before="0" w:after="40" w:line="252" w:lineRule="auto"/>
+      </w:pPr>
+      <w:r>
+        <w:rPr>
+          <w:rFonts w:ascii="Times New Roman" w:hAnsi="Times New Roman"/>
+          <w:b/>
+          <w:color w:val="000000"/>
+          <w:sz w:val="24"/>
+        </w:rPr>
+        <w:t xml:space="preserve">[7] Law Commission of Bangladesh &amp; World Bank: </w:t>
+      </w:r>
+      <w:r>
+        <w:rPr>
+          <w:rFonts w:ascii="Times New Roman" w:hAnsi="Times New Roman"/>
+          <w:color w:val="000000"/>
+          <w:sz w:val="24"/>
+        </w:rPr>
+        <w:t>Studies on Civil Litigation Backlogs, Land Governance, and Title Disputes in Bangladesh.</w:t>
       </w:r>
     </w:p>
     <w:sectPr>
@@ -3361,7 +2960,7 @@
 </file>
 
 <file path=word/numbering.xml><?xml version="1.0" encoding="utf-8"?>
-<w:numbering xmlns:wpc="http://schemas.microsoft.com/office/word/2010/wordprocessingCanvas" xmlns:mc="http://schemas.openxmlformats.org/markup-compatibility/2006" xmlns:o="urn:schemas-microsoft-com:office:office" xmlns:r="http://schemas.openxmlformats.org/officeDocument/2006/relationships" xmlns:m="http://schemas.openxmlformats.org/officeDocument/2006/math" xmlns:v="urn:schemas-microsoft-com:vml" xmlns:wp14="http://schemas.microsoft.com/office/word/2010/wordprocessingDrawing" xmlns:wp="http://schemas.openxmlformats.org/drawingml/2006/wordprocessingDrawing" xmlns:w10="urn:schemas-microsoft-com:office:word" xmlns:w="http://schemas.openxmlformats.org/wordprocessingml/2006/main" xmlns:w14="http://schemas.microsoft.com/office/word/2010/wordml" xmlns:wpg="http://schemas.microsoft.com/office/word/2010/wordprocessingGroup" xmlns:wpi="http://schemas.microsoft.com/office/word/2010/wordprocessingInk" xmlns:wne="http://schemas.microsoft.com/office/word/2006/wordml" xmlns:wps="http://schemas.microsoft.com/office/word/2010/wordprocessingShape" mc:Ignorable="w14 wp14">
+<w:numbering xmlns:wpc="http://schemas.microsoft.com/office/word/2010/wordprocessingCanvas" xmlns:mo="http://schemas.microsoft.com/office/mac/office/2008/main" xmlns:mc="http://schemas.openxmlformats.org/markup-compatibility/2006" xmlns:mv="urn:schemas-microsoft-com:mac:vml" xmlns:o="urn:schemas-microsoft-com:office:office" xmlns:r="http://schemas.openxmlformats.org/officeDocument/2006/relationships" xmlns:m="http://schemas.openxmlformats.org/officeDocument/2006/math" xmlns:v="urn:schemas-microsoft-com:vml" xmlns:wp14="http://schemas.microsoft.com/office/word/2010/wordprocessingDrawing" xmlns:wp="http://schemas.openxmlformats.org/drawingml/2006/wordprocessingDrawing" xmlns:w10="urn:schemas-microsoft-com:office:word" xmlns:w="http://schemas.openxmlformats.org/wordprocessingml/2006/main" xmlns:w14="http://schemas.microsoft.com/office/word/2010/wordml" xmlns:wpg="http://schemas.microsoft.com/office/word/2010/wordprocessingGroup" xmlns:wpi="http://schemas.microsoft.com/office/word/2010/wordprocessingInk" xmlns:wne="http://schemas.microsoft.com/office/word/2006/wordml" xmlns:wps="http://schemas.microsoft.com/office/word/2010/wordprocessingShape" mc:Ignorable="w14 wp14">
   <w:abstractNum w:abstractNumId="0">
     <w:nsid w:val="FFFFFF7C"/>
     <w:multiLevelType w:val="singleLevel"/>
@@ -3580,7 +3179,7 @@
       </w:pPr>
     </w:pPrDefault>
   </w:docDefaults>
-  <w:latentStyles w:defLockedState="0" w:defUIPriority="99" w:defSemiHidden="1" w:defUnhideWhenUsed="1" w:defQFormat="0" w:count="267">
+  <w:latentStyles w:defLockedState="0" w:defUIPriority="99" w:defSemiHidden="1" w:defUnhideWhenUsed="1" w:defQFormat="0" w:count="276">
     <w:lsdException w:name="Normal" w:semiHidden="0" w:uiPriority="0" w:unhideWhenUsed="0" w:qFormat="1"/>
     <w:lsdException w:name="heading 1" w:semiHidden="0" w:uiPriority="9" w:unhideWhenUsed="0" w:qFormat="1"/>
     <w:lsdException w:name="heading 2" w:uiPriority="9" w:qFormat="1"/>
@@ -3724,6 +3323,50 @@
     <w:qFormat/>
     <w:rsid w:val="00FC693F"/>
   </w:style>
+  <w:style w:type="paragraph" w:styleId="Header">
+    <w:name w:val="header"/>
+    <w:basedOn w:val="Normal"/>
+    <w:link w:val="HeaderChar"/>
+    <w:uiPriority w:val="99"/>
+    <w:unhideWhenUsed/>
+    <w:rsid w:val="00E618BF"/>
+    <w:pPr>
+      <w:tabs>
+        <w:tab w:val="center" w:pos="4680"/>
+        <w:tab w:val="right" w:pos="9360"/>
+      </w:tabs>
+      <w:spacing w:after="0" w:line="240" w:lineRule="auto"/>
+    </w:pPr>
+  </w:style>
+  <w:style w:type="character" w:customStyle="1" w:styleId="HeaderChar">
+    <w:name w:val="Header Char"/>
+    <w:basedOn w:val="DefaultParagraphFont"/>
+    <w:link w:val="Header"/>
+    <w:uiPriority w:val="99"/>
+    <w:rsid w:val="00E618BF"/>
+  </w:style>
+  <w:style w:type="paragraph" w:styleId="Footer">
+    <w:name w:val="footer"/>
+    <w:basedOn w:val="Normal"/>
+    <w:link w:val="FooterChar"/>
+    <w:uiPriority w:val="99"/>
+    <w:unhideWhenUsed/>
+    <w:rsid w:val="00E618BF"/>
+    <w:pPr>
+      <w:tabs>
+        <w:tab w:val="center" w:pos="4680"/>
+        <w:tab w:val="right" w:pos="9360"/>
+      </w:tabs>
+      <w:spacing w:after="0" w:line="240" w:lineRule="auto"/>
+    </w:pPr>
+  </w:style>
+  <w:style w:type="character" w:customStyle="1" w:styleId="FooterChar">
+    <w:name w:val="Footer Char"/>
+    <w:basedOn w:val="DefaultParagraphFont"/>
+    <w:link w:val="Footer"/>
+    <w:uiPriority w:val="99"/>
+    <w:rsid w:val="00E618BF"/>
+  </w:style>
   <w:style w:type="paragraph" w:styleId="Heading1">
     <w:name w:val="heading 1"/>
     <w:basedOn w:val="Normal"/>
@@ -3959,50 +3602,6 @@
     <w:uiPriority w:val="99"/>
     <w:semiHidden/>
     <w:unhideWhenUsed/>
-  </w:style>
-  <w:style w:type="paragraph" w:styleId="Header">
-    <w:name w:val="header"/>
-    <w:basedOn w:val="Normal"/>
-    <w:link w:val="HeaderChar"/>
-    <w:uiPriority w:val="99"/>
-    <w:unhideWhenUsed/>
-    <w:rsid w:val="00E618BF"/>
-    <w:pPr>
-      <w:tabs>
-        <w:tab w:val="center" w:pos="4680"/>
-        <w:tab w:val="right" w:pos="9360"/>
-      </w:tabs>
-      <w:spacing w:after="0" w:line="240" w:lineRule="auto"/>
-    </w:pPr>
-  </w:style>
-  <w:style w:type="character" w:customStyle="1" w:styleId="HeaderChar">
-    <w:name w:val="Header Char"/>
-    <w:basedOn w:val="DefaultParagraphFont"/>
-    <w:link w:val="Header"/>
-    <w:uiPriority w:val="99"/>
-    <w:rsid w:val="00E618BF"/>
-  </w:style>
-  <w:style w:type="paragraph" w:styleId="Footer">
-    <w:name w:val="footer"/>
-    <w:basedOn w:val="Normal"/>
-    <w:link w:val="FooterChar"/>
-    <w:uiPriority w:val="99"/>
-    <w:unhideWhenUsed/>
-    <w:rsid w:val="00E618BF"/>
-    <w:pPr>
-      <w:tabs>
-        <w:tab w:val="center" w:pos="4680"/>
-        <w:tab w:val="right" w:pos="9360"/>
-      </w:tabs>
-      <w:spacing w:after="0" w:line="240" w:lineRule="auto"/>
-    </w:pPr>
-  </w:style>
-  <w:style w:type="character" w:customStyle="1" w:styleId="FooterChar">
-    <w:name w:val="Footer Char"/>
-    <w:basedOn w:val="DefaultParagraphFont"/>
-    <w:link w:val="Footer"/>
-    <w:uiPriority w:val="99"/>
-    <w:rsid w:val="00E618BF"/>
   </w:style>
   <w:style w:type="paragraph" w:styleId="NoSpacing">
     <w:name w:val="No Spacing"/>
@@ -15406,23 +15005,11 @@
       </w:tcPr>
     </w:tblStylePr>
   </w:style>
-  <w:style w:type="character" w:styleId="Hyperlink">
-    <w:name w:val="Hyperlink"/>
-    <w:basedOn w:val="DefaultParagraphFont"/>
-    <w:uiPriority w:val="99"/>
-    <w:semiHidden/>
-    <w:unhideWhenUsed/>
-    <w:rsid w:val="00F045BA"/>
-    <w:rPr>
-      <w:color w:val="0000FF"/>
-      <w:u w:val="single"/>
-    </w:rPr>
-  </w:style>
 </w:styles>
 </file>
 
 <file path=word/stylesWithEffects.xml><?xml version="1.0" encoding="utf-8"?>
-<w:styles xmlns:wpc="http://schemas.microsoft.com/office/word/2010/wordprocessingCanvas" xmlns:mc="http://schemas.openxmlformats.org/markup-compatibility/2006" xmlns:o="urn:schemas-microsoft-com:office:office" xmlns:r="http://schemas.openxmlformats.org/officeDocument/2006/relationships" xmlns:m="http://schemas.openxmlformats.org/officeDocument/2006/math" xmlns:v="urn:schemas-microsoft-com:vml" xmlns:wp14="http://schemas.microsoft.com/office/word/2010/wordprocessingDrawing" xmlns:wp="http://schemas.openxmlformats.org/drawingml/2006/wordprocessingDrawing" xmlns:w10="urn:schemas-microsoft-com:office:word" xmlns:w="http://schemas.openxmlformats.org/wordprocessingml/2006/main" xmlns:w14="http://schemas.microsoft.com/office/word/2010/wordml" xmlns:wpg="http://schemas.microsoft.com/office/word/2010/wordprocessingGroup" xmlns:wpi="http://schemas.microsoft.com/office/word/2010/wordprocessingInk" xmlns:wne="http://schemas.microsoft.com/office/word/2006/wordml" xmlns:wps="http://schemas.microsoft.com/office/word/2010/wordprocessingShape" mc:Ignorable="w14 wp14">
+<w:styles xmlns:wpc="http://schemas.microsoft.com/office/word/2010/wordprocessingCanvas" xmlns:mo="http://schemas.microsoft.com/office/mac/office/2008/main" xmlns:mc="http://schemas.openxmlformats.org/markup-compatibility/2006" xmlns:mv="urn:schemas-microsoft-com:mac:vml" xmlns:o="urn:schemas-microsoft-com:office:office" xmlns:r="http://schemas.openxmlformats.org/officeDocument/2006/relationships" xmlns:m="http://schemas.openxmlformats.org/officeDocument/2006/math" xmlns:v="urn:schemas-microsoft-com:vml" xmlns:wp14="http://schemas.microsoft.com/office/word/2010/wordprocessingDrawing" xmlns:wp="http://schemas.openxmlformats.org/drawingml/2006/wordprocessingDrawing" xmlns:w10="urn:schemas-microsoft-com:office:word" xmlns:w="http://schemas.openxmlformats.org/wordprocessingml/2006/main" xmlns:w14="http://schemas.microsoft.com/office/word/2010/wordml" xmlns:wpg="http://schemas.microsoft.com/office/word/2010/wordprocessingGroup" xmlns:wpi="http://schemas.microsoft.com/office/word/2010/wordprocessingInk" xmlns:wne="http://schemas.microsoft.com/office/word/2006/wordml" xmlns:wps="http://schemas.microsoft.com/office/word/2010/wordprocessingShape" mc:Ignorable="w14 wp14">
   <w:docDefaults>
     <w:rPrDefault>
       <w:rPr>
@@ -15438,7 +15025,7 @@
       </w:pPr>
     </w:pPrDefault>
   </w:docDefaults>
-  <w:latentStyles w:defLockedState="0" w:defUIPriority="99" w:defSemiHidden="1" w:defUnhideWhenUsed="1" w:defQFormat="0" w:count="267">
+  <w:latentStyles w:defLockedState="0" w:defUIPriority="99" w:defSemiHidden="1" w:defUnhideWhenUsed="1" w:defQFormat="0" w:count="276">
     <w:lsdException w:name="Normal" w:semiHidden="0" w:uiPriority="0" w:unhideWhenUsed="0" w:qFormat="1"/>
     <w:lsdException w:name="heading 1" w:semiHidden="0" w:uiPriority="9" w:unhideWhenUsed="0" w:qFormat="1"/>
     <w:lsdException w:name="heading 2" w:uiPriority="9" w:qFormat="1"/>
@@ -15818,50 +15405,6 @@
     <w:semiHidden/>
     <w:unhideWhenUsed/>
   </w:style>
-  <w:style w:type="paragraph" w:styleId="Header">
-    <w:name w:val="header"/>
-    <w:basedOn w:val="Normal"/>
-    <w:link w:val="HeaderChar"/>
-    <w:uiPriority w:val="99"/>
-    <w:unhideWhenUsed/>
-    <w:rsid w:val="00E618BF"/>
-    <w:pPr>
-      <w:tabs>
-        <w:tab w:val="center" w:pos="4680"/>
-        <w:tab w:val="right" w:pos="9360"/>
-      </w:tabs>
-      <w:spacing w:after="0" w:line="240" w:lineRule="auto"/>
-    </w:pPr>
-  </w:style>
-  <w:style w:type="character" w:customStyle="1" w:styleId="HeaderChar">
-    <w:name w:val="Header Char"/>
-    <w:basedOn w:val="DefaultParagraphFont"/>
-    <w:link w:val="Header"/>
-    <w:uiPriority w:val="99"/>
-    <w:rsid w:val="00E618BF"/>
-  </w:style>
-  <w:style w:type="paragraph" w:styleId="Footer">
-    <w:name w:val="footer"/>
-    <w:basedOn w:val="Normal"/>
-    <w:link w:val="FooterChar"/>
-    <w:uiPriority w:val="99"/>
-    <w:unhideWhenUsed/>
-    <w:rsid w:val="00E618BF"/>
-    <w:pPr>
-      <w:tabs>
-        <w:tab w:val="center" w:pos="4680"/>
-        <w:tab w:val="right" w:pos="9360"/>
-      </w:tabs>
-      <w:spacing w:after="0" w:line="240" w:lineRule="auto"/>
-    </w:pPr>
-  </w:style>
-  <w:style w:type="character" w:customStyle="1" w:styleId="FooterChar">
-    <w:name w:val="Footer Char"/>
-    <w:basedOn w:val="DefaultParagraphFont"/>
-    <w:link w:val="Footer"/>
-    <w:uiPriority w:val="99"/>
-    <w:rsid w:val="00E618BF"/>
-  </w:style>
   <w:style w:type="paragraph" w:styleId="NoSpacing">
     <w:name w:val="No Spacing"/>
     <w:uiPriority w:val="1"/>
@@ -27263,18 +26806,6 @@
         <w:shd w:val="clear" w:color="auto" w:fill="FBCAA2" w:themeFill="accent6" w:themeFillTint="7F"/>
       </w:tcPr>
     </w:tblStylePr>
-  </w:style>
-  <w:style w:type="character" w:styleId="Hyperlink">
-    <w:name w:val="Hyperlink"/>
-    <w:basedOn w:val="DefaultParagraphFont"/>
-    <w:uiPriority w:val="99"/>
-    <w:semiHidden/>
-    <w:unhideWhenUsed/>
-    <w:rsid w:val="00F045BA"/>
-    <w:rPr>
-      <w:color w:val="0000FF"/>
-      <w:u w:val="single"/>
-    </w:rPr>
   </w:style>
 </w:styles>
 </file>
@@ -27604,7 +27135,7 @@
 </file>
 
 <file path=customXml/itemProps1.xml><?xml version="1.0" encoding="utf-8"?>
-<ds:datastoreItem xmlns:ds="http://schemas.openxmlformats.org/officeDocument/2006/customXml" ds:itemID="{02C85949-E101-4996-8A47-FB8A4AD1A07C}">
+<ds:datastoreItem xmlns:ds="http://schemas.openxmlformats.org/officeDocument/2006/customXml" ds:itemID="{EF278816-EC6F-A645-907D-7F25AECB1D4A}">
   <ds:schemaRefs>
     <ds:schemaRef ds:uri="http://schemas.openxmlformats.org/officeDocument/2006/bibliography"/>
   </ds:schemaRefs>

</xml_diff>